<commit_message>
Subiendo carpeta de ejemplos de POO
</commit_message>
<xml_diff>
--- a/Diccionario Jair.docx
+++ b/Diccionario Jair.docx
@@ -303,7 +303,7 @@
     <w:p>
       <w:r>
         <w:pict w14:anchorId="0A07AAA6">
-          <v:rect id="_x0000_i1073" style="width:0;height:1.5pt" o:hralign="center" o:hrstd="t" o:hr="t" fillcolor="#a0a0a0" stroked="f"/>
+          <v:rect id="_x0000_i1025" style="width:0;height:1.5pt" o:hralign="center" o:hrstd="t" o:hr="t" fillcolor="#a0a0a0" stroked="f"/>
         </w:pict>
       </w:r>
     </w:p>
@@ -482,7 +482,7 @@
     <w:p>
       <w:r>
         <w:pict w14:anchorId="632A4A3D">
-          <v:rect id="_x0000_i1074" style="width:0;height:1.5pt" o:hralign="center" o:hrstd="t" o:hr="t" fillcolor="#a0a0a0" stroked="f"/>
+          <v:rect id="_x0000_i1026" style="width:0;height:1.5pt" o:hralign="center" o:hrstd="t" o:hr="t" fillcolor="#a0a0a0" stroked="f"/>
         </w:pict>
       </w:r>
     </w:p>
@@ -558,7 +558,7 @@
     <w:p>
       <w:r>
         <w:pict w14:anchorId="686EFF3E">
-          <v:rect id="_x0000_i1075" style="width:0;height:1.5pt" o:hralign="center" o:hrstd="t" o:hr="t" fillcolor="#a0a0a0" stroked="f"/>
+          <v:rect id="_x0000_i1027" style="width:0;height:1.5pt" o:hralign="center" o:hrstd="t" o:hr="t" fillcolor="#a0a0a0" stroked="f"/>
         </w:pict>
       </w:r>
     </w:p>
@@ -674,7 +674,7 @@
     <w:p>
       <w:r>
         <w:pict w14:anchorId="0542DBBF">
-          <v:rect id="_x0000_i1076" style="width:0;height:1.5pt" o:hralign="center" o:hrstd="t" o:hr="t" fillcolor="#a0a0a0" stroked="f"/>
+          <v:rect id="_x0000_i1028" style="width:0;height:1.5pt" o:hralign="center" o:hrstd="t" o:hr="t" fillcolor="#a0a0a0" stroked="f"/>
         </w:pict>
       </w:r>
     </w:p>
@@ -1138,7 +1138,7 @@
     <w:p>
       <w:r>
         <w:pict w14:anchorId="70F4E947">
-          <v:rect id="_x0000_i1077" style="width:0;height:1.5pt" o:hralign="center" o:hrstd="t" o:hr="t" fillcolor="#a0a0a0" stroked="f"/>
+          <v:rect id="_x0000_i1029" style="width:0;height:1.5pt" o:hralign="center" o:hrstd="t" o:hr="t" fillcolor="#a0a0a0" stroked="f"/>
         </w:pict>
       </w:r>
     </w:p>
@@ -1311,7 +1311,7 @@
     <w:p>
       <w:r>
         <w:pict w14:anchorId="7EA64026">
-          <v:rect id="_x0000_i1078" style="width:0;height:1.5pt" o:hralign="center" o:hrstd="t" o:hr="t" fillcolor="#a0a0a0" stroked="f"/>
+          <v:rect id="_x0000_i1030" style="width:0;height:1.5pt" o:hralign="center" o:hrstd="t" o:hr="t" fillcolor="#a0a0a0" stroked="f"/>
         </w:pict>
       </w:r>
     </w:p>
@@ -3017,7 +3017,7 @@
     <w:p>
       <w:r>
         <w:pict w14:anchorId="4AF7FFA5">
-          <v:rect id="_x0000_i1079" style="width:0;height:1.5pt" o:hralign="center" o:hrstd="t" o:hr="t" fillcolor="#a0a0a0" stroked="f"/>
+          <v:rect id="_x0000_i1031" style="width:0;height:1.5pt" o:hralign="center" o:hrstd="t" o:hr="t" fillcolor="#a0a0a0" stroked="f"/>
         </w:pict>
       </w:r>
     </w:p>
@@ -3778,7 +3778,7 @@
     <w:p>
       <w:r>
         <w:pict w14:anchorId="271730F0">
-          <v:rect id="_x0000_i1080" style="width:0;height:1.5pt" o:hralign="center" o:hrstd="t" o:hr="t" fillcolor="#a0a0a0" stroked="f"/>
+          <v:rect id="_x0000_i1032" style="width:0;height:1.5pt" o:hralign="center" o:hrstd="t" o:hr="t" fillcolor="#a0a0a0" stroked="f"/>
         </w:pict>
       </w:r>
     </w:p>
@@ -3910,135 +3910,233 @@
     </w:p>
     <w:p>
       <w:pPr>
+        <w:pStyle w:val="Ttulo1"/>
+      </w:pPr>
+      <w:r>
+        <w:t>PARTE 2: ESTRUCTURAS DE CONTROL Y BUCLES EN PHP</w:t>
+      </w:r>
+    </w:p>
+    <w:p>
+      <w:r>
+        <w:t xml:space="preserve">Las </w:t>
+      </w:r>
+      <w:r>
         <w:rPr>
           <w:b/>
           <w:bCs/>
         </w:rPr>
-      </w:pPr>
+        <w:t>estructuras de control</w:t>
+      </w:r>
+      <w:r>
+        <w:t xml:space="preserve"> permiten que un programa tome decisiones y repita acciones dependiendo de condiciones específicas.</w:t>
+      </w:r>
+      <w:r>
+        <w:br/>
+        <w:t xml:space="preserve">En otras palabras, hacen que el código sea </w:t>
+      </w:r>
       <w:r>
         <w:rPr>
           <w:b/>
           <w:bCs/>
         </w:rPr>
-        <w:t>PARTE 2: ESTRUCTURAS DE CONTROL Y BUCLES EN PHP</w:t>
-      </w:r>
-    </w:p>
-    <w:p>
-      <w:r>
-        <w:t xml:space="preserve">Las </w:t>
+        <w:t>dinámico e inteligente</w:t>
+      </w:r>
+      <w:r>
+        <w:t>, en lugar de ejecutarse de manera lineal.</w:t>
+      </w:r>
+    </w:p>
+    <w:p>
+      <w:r>
+        <w:pict w14:anchorId="0B3B3500">
+          <v:rect id="_x0000_i1033" style="width:0;height:1.5pt" o:hralign="center" o:hrstd="t" o:hr="t" fillcolor="#a0a0a0" stroked="f"/>
+        </w:pict>
+      </w:r>
+    </w:p>
+    <w:p>
+      <w:pPr>
+        <w:pStyle w:val="Ttulo2"/>
+      </w:pPr>
+      <w:r>
+        <w:rPr>
+          <w:rFonts w:ascii="Segoe UI Emoji" w:hAnsi="Segoe UI Emoji" w:cs="Segoe UI Emoji"/>
+        </w:rPr>
+        <w:t>🔹</w:t>
+      </w:r>
+      <w:r>
+        <w:t xml:space="preserve"> 1. Condicional </w:t>
+      </w:r>
+      <w:proofErr w:type="spellStart"/>
+      <w:r>
+        <w:t>if</w:t>
+      </w:r>
+      <w:proofErr w:type="spellEnd"/>
+    </w:p>
+    <w:p>
+      <w:r>
+        <w:t xml:space="preserve">Sirve para </w:t>
       </w:r>
       <w:r>
         <w:rPr>
           <w:b/>
           <w:bCs/>
         </w:rPr>
-        <w:t>estructuras de control</w:t>
-      </w:r>
-      <w:r>
-        <w:t xml:space="preserve"> permiten que un programa tome decisiones y repita acciones dependiendo de condiciones específicas.</w:t>
+        <w:t>ejecutar código solo si una condición se cumple</w:t>
+      </w:r>
+      <w:r>
+        <w:t>.</w:t>
       </w:r>
       <w:r>
         <w:br/>
-        <w:t xml:space="preserve">En otras palabras, hacen que el código sea </w:t>
-      </w:r>
+        <w:t>Si la condición no se cumple, se ignora el bloque.</w:t>
+      </w:r>
+    </w:p>
+    <w:p>
       <w:r>
         <w:rPr>
           <w:b/>
           <w:bCs/>
         </w:rPr>
-        <w:t>dinámico e inteligente</w:t>
-      </w:r>
-      <w:r>
-        <w:t>, en lugar de ejecutarse de manera lineal.</w:t>
-      </w:r>
-    </w:p>
-    <w:p>
-      <w:r>
-        <w:pict w14:anchorId="0B3B3500">
-          <v:rect id="_x0000_i1161" style="width:0;height:1.5pt" o:hralign="center" o:hrstd="t" o:hr="t" fillcolor="#a0a0a0" stroked="f"/>
-        </w:pict>
-      </w:r>
-    </w:p>
-    <w:p>
-      <w:pPr>
-        <w:pStyle w:val="Ttulo2"/>
-      </w:pPr>
-      <w:r>
-        <w:rPr>
-          <w:rFonts w:ascii="Segoe UI Emoji" w:hAnsi="Segoe UI Emoji" w:cs="Segoe UI Emoji"/>
-        </w:rPr>
-        <w:t>🔹</w:t>
-      </w:r>
-      <w:r>
-        <w:t xml:space="preserve"> 1. Condicional </w:t>
-      </w:r>
+        <w:t>Sintaxis básica:</w:t>
+      </w:r>
+    </w:p>
+    <w:p>
       <w:proofErr w:type="spellStart"/>
       <w:r>
         <w:t>if</w:t>
       </w:r>
       <w:proofErr w:type="spellEnd"/>
-    </w:p>
-    <w:p>
-      <w:r>
-        <w:t xml:space="preserve">Sirve para </w:t>
-      </w:r>
+      <w:r>
+        <w:t xml:space="preserve"> (condición) {</w:t>
+      </w:r>
+    </w:p>
+    <w:p>
+      <w:r>
+        <w:lastRenderedPageBreak/>
+        <w:t xml:space="preserve">    // código a ejecutar si la condición es verdadera</w:t>
+      </w:r>
+    </w:p>
+    <w:p>
+      <w:r>
+        <w:t>}</w:t>
+      </w:r>
+    </w:p>
+    <w:p>
       <w:r>
         <w:rPr>
           <w:b/>
           <w:bCs/>
         </w:rPr>
-        <w:t>ejecutar código solo si una condición se cumple</w:t>
-      </w:r>
-      <w:r>
-        <w:t>.</w:t>
-      </w:r>
-      <w:r>
-        <w:br/>
-        <w:t>Si la condición no se cumple, se ignora el bloque.</w:t>
-      </w:r>
-    </w:p>
-    <w:p>
+        <w:t>Ejemplo:</w:t>
+      </w:r>
+    </w:p>
+    <w:p>
+      <w:r>
+        <w:t>$edad = 20;</w:t>
+      </w:r>
+    </w:p>
+    <w:p>
+      <w:proofErr w:type="spellStart"/>
+      <w:r>
+        <w:t>if</w:t>
+      </w:r>
+      <w:proofErr w:type="spellEnd"/>
+      <w:r>
+        <w:t xml:space="preserve"> ($edad &gt;= 18) {</w:t>
+      </w:r>
+    </w:p>
+    <w:p>
+      <w:r>
+        <w:t xml:space="preserve">    echo "Eres mayor de edad";</w:t>
+      </w:r>
+    </w:p>
+    <w:p>
+      <w:r>
+        <w:t>}</w:t>
+      </w:r>
+    </w:p>
+    <w:p>
+      <w:r>
+        <w:rPr>
+          <w:rFonts w:ascii="Segoe UI Emoji" w:hAnsi="Segoe UI Emoji" w:cs="Segoe UI Emoji"/>
+        </w:rPr>
+        <w:t>📘</w:t>
+      </w:r>
+      <w:r>
+        <w:t xml:space="preserve"> </w:t>
+      </w:r>
+      <w:r>
+        <w:rPr>
+          <w:i/>
+          <w:iCs/>
+        </w:rPr>
+        <w:t>Salida:</w:t>
+      </w:r>
+      <w:r>
+        <w:t xml:space="preserve"> Eres mayor de edad</w:t>
+      </w:r>
+    </w:p>
+    <w:p>
+      <w:r>
+        <w:pict w14:anchorId="796CFD77">
+          <v:rect id="_x0000_i1034" style="width:0;height:1.5pt" o:hralign="center" o:hrstd="t" o:hr="t" fillcolor="#a0a0a0" stroked="f"/>
+        </w:pict>
+      </w:r>
+    </w:p>
+    <w:p>
+      <w:pPr>
+        <w:pStyle w:val="Ttulo2"/>
+      </w:pPr>
+      <w:r>
+        <w:rPr>
+          <w:rFonts w:ascii="Segoe UI Emoji" w:hAnsi="Segoe UI Emoji" w:cs="Segoe UI Emoji"/>
+        </w:rPr>
+        <w:t>🔹</w:t>
+      </w:r>
+      <w:r>
+        <w:t xml:space="preserve"> 2. Condicional </w:t>
+      </w:r>
+      <w:proofErr w:type="spellStart"/>
+      <w:r>
+        <w:t>if</w:t>
+      </w:r>
+      <w:proofErr w:type="spellEnd"/>
+      <w:r>
+        <w:t>...</w:t>
+      </w:r>
+      <w:proofErr w:type="spellStart"/>
+      <w:r>
+        <w:t>else</w:t>
+      </w:r>
+      <w:proofErr w:type="spellEnd"/>
+    </w:p>
+    <w:p>
+      <w:r>
+        <w:t xml:space="preserve">Se usa cuando quieres que el programa haga </w:t>
+      </w:r>
       <w:r>
         <w:rPr>
           <w:b/>
           <w:bCs/>
         </w:rPr>
-        <w:t>Sintaxis básica:</w:t>
-      </w:r>
-    </w:p>
-    <w:p>
-      <w:proofErr w:type="spellStart"/>
-      <w:r>
-        <w:t>if</w:t>
-      </w:r>
-      <w:proofErr w:type="spellEnd"/>
-      <w:r>
-        <w:t xml:space="preserve"> (condición) {</w:t>
-      </w:r>
-    </w:p>
-    <w:p>
-      <w:r>
-        <w:t xml:space="preserve">    // código a ejecutar si la condición es verdadera</w:t>
-      </w:r>
-    </w:p>
-    <w:p>
-      <w:r>
-        <w:lastRenderedPageBreak/>
-        <w:t>}</w:t>
-      </w:r>
-    </w:p>
-    <w:p>
+        <w:t>una cosa si la condición es verdadera</w:t>
+      </w:r>
+      <w:r>
+        <w:t xml:space="preserve"> y </w:t>
+      </w:r>
       <w:r>
         <w:rPr>
           <w:b/>
           <w:bCs/>
         </w:rPr>
-        <w:t>Ejemplo:</w:t>
-      </w:r>
-    </w:p>
-    <w:p>
-      <w:r>
-        <w:t>$edad = 20;</w:t>
+        <w:t>otra si es falsa</w:t>
+      </w:r>
+      <w:r>
+        <w:t>.</w:t>
+      </w:r>
+    </w:p>
+    <w:p>
+      <w:r>
+        <w:t>$edad = 16;</w:t>
       </w:r>
     </w:p>
     <w:p>
@@ -4054,6 +4152,24 @@
     <w:p>
       <w:r>
         <w:t xml:space="preserve">    echo "Eres mayor de edad";</w:t>
+      </w:r>
+    </w:p>
+    <w:p>
+      <w:r>
+        <w:t xml:space="preserve">} </w:t>
+      </w:r>
+      <w:proofErr w:type="spellStart"/>
+      <w:r>
+        <w:t>else</w:t>
+      </w:r>
+      <w:proofErr w:type="spellEnd"/>
+      <w:r>
+        <w:t xml:space="preserve"> {</w:t>
+      </w:r>
+    </w:p>
+    <w:p>
+      <w:r>
+        <w:t xml:space="preserve">    echo "Eres menor de edad";</w:t>
       </w:r>
     </w:p>
     <w:p>
@@ -4079,13 +4195,13 @@
         <w:t>Salida:</w:t>
       </w:r>
       <w:r>
-        <w:t xml:space="preserve"> Eres mayor de edad</w:t>
-      </w:r>
-    </w:p>
-    <w:p>
-      <w:r>
-        <w:pict w14:anchorId="796CFD77">
-          <v:rect id="_x0000_i1162" style="width:0;height:1.5pt" o:hralign="center" o:hrstd="t" o:hr="t" fillcolor="#a0a0a0" stroked="f"/>
+        <w:t xml:space="preserve"> Eres menor de edad</w:t>
+      </w:r>
+    </w:p>
+    <w:p>
+      <w:r>
+        <w:pict w14:anchorId="6544AE79">
+          <v:rect id="_x0000_i1035" style="width:0;height:1.5pt" o:hralign="center" o:hrstd="t" o:hr="t" fillcolor="#a0a0a0" stroked="f"/>
         </w:pict>
       </w:r>
     </w:p>
@@ -4097,10 +4213,11 @@
         <w:rPr>
           <w:rFonts w:ascii="Segoe UI Emoji" w:hAnsi="Segoe UI Emoji" w:cs="Segoe UI Emoji"/>
         </w:rPr>
+        <w:lastRenderedPageBreak/>
         <w:t>🔹</w:t>
       </w:r>
       <w:r>
-        <w:t xml:space="preserve"> 2. Condicional </w:t>
+        <w:t xml:space="preserve"> 3. Condicional </w:t>
       </w:r>
       <w:proofErr w:type="spellStart"/>
       <w:r>
@@ -4112,76 +4229,269 @@
       </w:r>
       <w:proofErr w:type="spellStart"/>
       <w:r>
+        <w:t>elseif</w:t>
+      </w:r>
+      <w:proofErr w:type="spellEnd"/>
+      <w:r>
+        <w:t>...</w:t>
+      </w:r>
+      <w:proofErr w:type="spellStart"/>
+      <w:r>
         <w:t>else</w:t>
       </w:r>
       <w:proofErr w:type="spellEnd"/>
     </w:p>
     <w:p>
       <w:r>
-        <w:t xml:space="preserve">Se usa cuando quieres que el programa haga </w:t>
+        <w:t xml:space="preserve">Sirve para </w:t>
       </w:r>
       <w:r>
         <w:rPr>
           <w:b/>
           <w:bCs/>
         </w:rPr>
-        <w:t>una cosa si la condición es verdadera</w:t>
-      </w:r>
-      <w:r>
-        <w:t xml:space="preserve"> y </w:t>
-      </w:r>
+        <w:t>evaluar varias condiciones</w:t>
+      </w:r>
+      <w:r>
+        <w:t xml:space="preserve"> en orden.</w:t>
+      </w:r>
+      <w:r>
+        <w:br/>
+        <w:t>El primer bloque que sea verdadero se ejecuta, y los demás se ignoran.</w:t>
+      </w:r>
+    </w:p>
+    <w:p>
+      <w:r>
+        <w:t>$nota = 85;</w:t>
+      </w:r>
+    </w:p>
+    <w:p/>
+    <w:p>
+      <w:proofErr w:type="spellStart"/>
+      <w:r>
+        <w:t>if</w:t>
+      </w:r>
+      <w:proofErr w:type="spellEnd"/>
+      <w:r>
+        <w:t xml:space="preserve"> ($nota &gt;= 90) {</w:t>
+      </w:r>
+    </w:p>
+    <w:p>
+      <w:r>
+        <w:t xml:space="preserve">    echo "Excelente";</w:t>
+      </w:r>
+    </w:p>
+    <w:p>
+      <w:r>
+        <w:t xml:space="preserve">} </w:t>
+      </w:r>
+      <w:proofErr w:type="spellStart"/>
+      <w:r>
+        <w:t>elseif</w:t>
+      </w:r>
+      <w:proofErr w:type="spellEnd"/>
+      <w:r>
+        <w:t xml:space="preserve"> ($nota &gt;= 75) {</w:t>
+      </w:r>
+    </w:p>
+    <w:p>
+      <w:r>
+        <w:t xml:space="preserve">    echo "Bueno";</w:t>
+      </w:r>
+    </w:p>
+    <w:p>
+      <w:r>
+        <w:t xml:space="preserve">} </w:t>
+      </w:r>
+      <w:proofErr w:type="spellStart"/>
+      <w:r>
+        <w:t>elseif</w:t>
+      </w:r>
+      <w:proofErr w:type="spellEnd"/>
+      <w:r>
+        <w:t xml:space="preserve"> ($nota &gt;= 60) {</w:t>
+      </w:r>
+    </w:p>
+    <w:p>
+      <w:r>
+        <w:t xml:space="preserve">    echo "Regular";</w:t>
+      </w:r>
+    </w:p>
+    <w:p>
+      <w:r>
+        <w:t xml:space="preserve">} </w:t>
+      </w:r>
+      <w:proofErr w:type="spellStart"/>
+      <w:r>
+        <w:t>else</w:t>
+      </w:r>
+      <w:proofErr w:type="spellEnd"/>
+      <w:r>
+        <w:t xml:space="preserve"> {</w:t>
+      </w:r>
+    </w:p>
+    <w:p>
+      <w:r>
+        <w:t xml:space="preserve">    echo "Insuficiente";</w:t>
+      </w:r>
+    </w:p>
+    <w:p>
+      <w:r>
+        <w:t>}</w:t>
+      </w:r>
+    </w:p>
+    <w:p>
+      <w:r>
+        <w:rPr>
+          <w:rFonts w:ascii="Segoe UI Emoji" w:hAnsi="Segoe UI Emoji" w:cs="Segoe UI Emoji"/>
+        </w:rPr>
+        <w:t>📘</w:t>
+      </w:r>
+      <w:r>
+        <w:t xml:space="preserve"> </w:t>
+      </w:r>
+      <w:r>
+        <w:rPr>
+          <w:i/>
+          <w:iCs/>
+        </w:rPr>
+        <w:t>Salida:</w:t>
+      </w:r>
+      <w:r>
+        <w:t xml:space="preserve"> Bueno</w:t>
+      </w:r>
+    </w:p>
+    <w:p>
+      <w:r>
+        <w:pict w14:anchorId="16E635B2">
+          <v:rect id="_x0000_i1036" style="width:0;height:1.5pt" o:hralign="center" o:hrstd="t" o:hr="t" fillcolor="#a0a0a0" stroked="f"/>
+        </w:pict>
+      </w:r>
+    </w:p>
+    <w:p>
+      <w:pPr>
+        <w:pStyle w:val="Ttulo2"/>
+      </w:pPr>
+      <w:r>
+        <w:rPr>
+          <w:rFonts w:ascii="Segoe UI Emoji" w:hAnsi="Segoe UI Emoji" w:cs="Segoe UI Emoji"/>
+        </w:rPr>
+        <w:t>🔹</w:t>
+      </w:r>
+      <w:r>
+        <w:t xml:space="preserve"> 4. Condicional abreviada (operador ternario)</w:t>
+      </w:r>
+    </w:p>
+    <w:p>
+      <w:r>
+        <w:t xml:space="preserve">Es una forma compacta de escribir un </w:t>
+      </w:r>
+      <w:proofErr w:type="spellStart"/>
+      <w:r>
+        <w:t>if</w:t>
+      </w:r>
+      <w:proofErr w:type="spellEnd"/>
+      <w:r>
+        <w:t>...</w:t>
+      </w:r>
+      <w:proofErr w:type="spellStart"/>
+      <w:r>
+        <w:t>else</w:t>
+      </w:r>
+      <w:proofErr w:type="spellEnd"/>
+      <w:r>
+        <w:t>.</w:t>
+      </w:r>
+      <w:r>
+        <w:br/>
+        <w:t>Perfecta para condiciones simples.</w:t>
+      </w:r>
+    </w:p>
+    <w:p>
       <w:r>
         <w:rPr>
           <w:b/>
           <w:bCs/>
         </w:rPr>
-        <w:t>otra si es falsa</w:t>
-      </w:r>
-      <w:r>
-        <w:t>.</w:t>
-      </w:r>
-    </w:p>
-    <w:p>
-      <w:r>
-        <w:t>$edad = 16;</w:t>
-      </w:r>
-    </w:p>
-    <w:p>
+        <w:t>Sintaxis:</w:t>
+      </w:r>
+    </w:p>
+    <w:p>
+      <w:r>
+        <w:t>(condición</w:t>
+      </w:r>
+      <w:proofErr w:type="gramStart"/>
+      <w:r>
+        <w:t>) ?</w:t>
+      </w:r>
+      <w:proofErr w:type="gramEnd"/>
+      <w:r>
+        <w:t xml:space="preserve"> </w:t>
+      </w:r>
       <w:proofErr w:type="spellStart"/>
       <w:r>
-        <w:t>if</w:t>
+        <w:t>valor_si_</w:t>
+      </w:r>
+      <w:proofErr w:type="gramStart"/>
+      <w:r>
+        <w:t>verdadero</w:t>
       </w:r>
       <w:proofErr w:type="spellEnd"/>
       <w:r>
-        <w:t xml:space="preserve"> ($edad &gt;= 18) {</w:t>
-      </w:r>
-    </w:p>
-    <w:p>
-      <w:r>
-        <w:t xml:space="preserve">    echo "Eres mayor de edad";</w:t>
-      </w:r>
-    </w:p>
-    <w:p>
-      <w:r>
-        <w:t xml:space="preserve">} </w:t>
+        <w:t xml:space="preserve"> :</w:t>
+      </w:r>
+      <w:proofErr w:type="gramEnd"/>
+      <w:r>
+        <w:t xml:space="preserve"> </w:t>
       </w:r>
       <w:proofErr w:type="spellStart"/>
       <w:r>
-        <w:t>else</w:t>
+        <w:t>valor_si_falso</w:t>
       </w:r>
       <w:proofErr w:type="spellEnd"/>
       <w:r>
-        <w:t xml:space="preserve"> {</w:t>
-      </w:r>
-    </w:p>
-    <w:p>
-      <w:r>
-        <w:t xml:space="preserve">    echo "Eres menor de edad";</w:t>
-      </w:r>
-    </w:p>
-    <w:p>
-      <w:r>
-        <w:t>}</w:t>
+        <w:t>;</w:t>
+      </w:r>
+    </w:p>
+    <w:p>
+      <w:r>
+        <w:rPr>
+          <w:b/>
+          <w:bCs/>
+        </w:rPr>
+        <w:lastRenderedPageBreak/>
+        <w:t>Ejemplo:</w:t>
+      </w:r>
+    </w:p>
+    <w:p>
+      <w:r>
+        <w:t>$edad = 18;</w:t>
+      </w:r>
+    </w:p>
+    <w:p>
+      <w:r>
+        <w:t>$mensaje = ($edad &gt;= 18</w:t>
+      </w:r>
+      <w:proofErr w:type="gramStart"/>
+      <w:r>
+        <w:t>) ?</w:t>
+      </w:r>
+      <w:proofErr w:type="gramEnd"/>
+      <w:r>
+        <w:t xml:space="preserve"> "Adulto</w:t>
+      </w:r>
+      <w:proofErr w:type="gramStart"/>
+      <w:r>
+        <w:t>" :</w:t>
+      </w:r>
+      <w:proofErr w:type="gramEnd"/>
+      <w:r>
+        <w:t xml:space="preserve"> "Menor";</w:t>
+      </w:r>
+    </w:p>
+    <w:p>
+      <w:r>
+        <w:t>echo $mensaje;</w:t>
       </w:r>
     </w:p>
     <w:p>
@@ -4202,330 +4512,13 @@
         <w:t>Salida:</w:t>
       </w:r>
       <w:r>
-        <w:t xml:space="preserve"> Eres menor de edad</w:t>
-      </w:r>
-    </w:p>
-    <w:p>
-      <w:r>
-        <w:pict w14:anchorId="6544AE79">
-          <v:rect id="_x0000_i1163" style="width:0;height:1.5pt" o:hralign="center" o:hrstd="t" o:hr="t" fillcolor="#a0a0a0" stroked="f"/>
-        </w:pict>
-      </w:r>
-    </w:p>
-    <w:p>
-      <w:pPr>
-        <w:pStyle w:val="Ttulo2"/>
-      </w:pPr>
-      <w:r>
-        <w:rPr>
-          <w:rFonts w:ascii="Segoe UI Emoji" w:hAnsi="Segoe UI Emoji" w:cs="Segoe UI Emoji"/>
-        </w:rPr>
-        <w:lastRenderedPageBreak/>
-        <w:t>🔹</w:t>
-      </w:r>
-      <w:r>
-        <w:t xml:space="preserve"> 3. Condicional </w:t>
-      </w:r>
-      <w:proofErr w:type="spellStart"/>
-      <w:r>
-        <w:t>if</w:t>
-      </w:r>
-      <w:proofErr w:type="spellEnd"/>
-      <w:r>
-        <w:t>...</w:t>
-      </w:r>
-      <w:proofErr w:type="spellStart"/>
-      <w:r>
-        <w:t>elseif</w:t>
-      </w:r>
-      <w:proofErr w:type="spellEnd"/>
-      <w:r>
-        <w:t>...</w:t>
-      </w:r>
-      <w:proofErr w:type="spellStart"/>
-      <w:r>
-        <w:t>else</w:t>
-      </w:r>
-      <w:proofErr w:type="spellEnd"/>
-    </w:p>
-    <w:p>
-      <w:r>
-        <w:t xml:space="preserve">Sirve para </w:t>
-      </w:r>
-      <w:r>
-        <w:rPr>
-          <w:b/>
-          <w:bCs/>
-        </w:rPr>
-        <w:t>evaluar varias condiciones</w:t>
-      </w:r>
-      <w:r>
-        <w:t xml:space="preserve"> en orden.</w:t>
-      </w:r>
-      <w:r>
-        <w:br/>
-        <w:t>El primer bloque que sea verdadero se ejecuta, y los demás se ignoran.</w:t>
-      </w:r>
-    </w:p>
-    <w:p>
-      <w:r>
-        <w:t>$nota = 85;</w:t>
-      </w:r>
-    </w:p>
-    <w:p/>
-    <w:p>
-      <w:proofErr w:type="spellStart"/>
-      <w:r>
-        <w:t>if</w:t>
-      </w:r>
-      <w:proofErr w:type="spellEnd"/>
-      <w:r>
-        <w:t xml:space="preserve"> ($nota &gt;= 90) {</w:t>
-      </w:r>
-    </w:p>
-    <w:p>
-      <w:r>
-        <w:t xml:space="preserve">    echo "Excelente";</w:t>
-      </w:r>
-    </w:p>
-    <w:p>
-      <w:r>
-        <w:t xml:space="preserve">} </w:t>
-      </w:r>
-      <w:proofErr w:type="spellStart"/>
-      <w:r>
-        <w:t>elseif</w:t>
-      </w:r>
-      <w:proofErr w:type="spellEnd"/>
-      <w:r>
-        <w:t xml:space="preserve"> ($nota &gt;= 75) {</w:t>
-      </w:r>
-    </w:p>
-    <w:p>
-      <w:r>
-        <w:t xml:space="preserve">    echo "Bueno";</w:t>
-      </w:r>
-    </w:p>
-    <w:p>
-      <w:r>
-        <w:t xml:space="preserve">} </w:t>
-      </w:r>
-      <w:proofErr w:type="spellStart"/>
-      <w:r>
-        <w:t>elseif</w:t>
-      </w:r>
-      <w:proofErr w:type="spellEnd"/>
-      <w:r>
-        <w:t xml:space="preserve"> ($nota &gt;= 60) {</w:t>
-      </w:r>
-    </w:p>
-    <w:p>
-      <w:r>
-        <w:t xml:space="preserve">    echo "Regular";</w:t>
-      </w:r>
-    </w:p>
-    <w:p>
-      <w:r>
-        <w:t xml:space="preserve">} </w:t>
-      </w:r>
-      <w:proofErr w:type="spellStart"/>
-      <w:r>
-        <w:t>else</w:t>
-      </w:r>
-      <w:proofErr w:type="spellEnd"/>
-      <w:r>
-        <w:t xml:space="preserve"> {</w:t>
-      </w:r>
-    </w:p>
-    <w:p>
-      <w:r>
-        <w:t xml:space="preserve">    echo "Insuficiente";</w:t>
-      </w:r>
-    </w:p>
-    <w:p>
-      <w:r>
-        <w:t>}</w:t>
-      </w:r>
-    </w:p>
-    <w:p>
-      <w:r>
-        <w:rPr>
-          <w:rFonts w:ascii="Segoe UI Emoji" w:hAnsi="Segoe UI Emoji" w:cs="Segoe UI Emoji"/>
-        </w:rPr>
-        <w:t>📘</w:t>
-      </w:r>
-      <w:r>
-        <w:t xml:space="preserve"> </w:t>
-      </w:r>
-      <w:r>
-        <w:rPr>
-          <w:i/>
-          <w:iCs/>
-        </w:rPr>
-        <w:t>Salida:</w:t>
-      </w:r>
-      <w:r>
-        <w:t xml:space="preserve"> Bueno</w:t>
-      </w:r>
-    </w:p>
-    <w:p>
-      <w:r>
-        <w:pict w14:anchorId="16E635B2">
-          <v:rect id="_x0000_i1164" style="width:0;height:1.5pt" o:hralign="center" o:hrstd="t" o:hr="t" fillcolor="#a0a0a0" stroked="f"/>
-        </w:pict>
-      </w:r>
-    </w:p>
-    <w:p>
-      <w:pPr>
-        <w:pStyle w:val="Ttulo2"/>
-      </w:pPr>
-      <w:r>
-        <w:rPr>
-          <w:rFonts w:ascii="Segoe UI Emoji" w:hAnsi="Segoe UI Emoji" w:cs="Segoe UI Emoji"/>
-        </w:rPr>
-        <w:t>🔹</w:t>
-      </w:r>
-      <w:r>
-        <w:t xml:space="preserve"> 4. Condicional abreviada (operador ternario)</w:t>
-      </w:r>
-    </w:p>
-    <w:p>
-      <w:r>
-        <w:t xml:space="preserve">Es una forma compacta de escribir un </w:t>
-      </w:r>
-      <w:proofErr w:type="spellStart"/>
-      <w:r>
-        <w:t>if</w:t>
-      </w:r>
-      <w:proofErr w:type="spellEnd"/>
-      <w:r>
-        <w:t>...</w:t>
-      </w:r>
-      <w:proofErr w:type="spellStart"/>
-      <w:r>
-        <w:t>else</w:t>
-      </w:r>
-      <w:proofErr w:type="spellEnd"/>
-      <w:r>
-        <w:t>.</w:t>
-      </w:r>
-      <w:r>
-        <w:br/>
-        <w:t>Perfecta para condiciones simples.</w:t>
-      </w:r>
-    </w:p>
-    <w:p>
-      <w:r>
-        <w:rPr>
-          <w:b/>
-          <w:bCs/>
-        </w:rPr>
-        <w:t>Sintaxis:</w:t>
-      </w:r>
-    </w:p>
-    <w:p>
-      <w:r>
-        <w:t>(condición</w:t>
-      </w:r>
-      <w:proofErr w:type="gramStart"/>
-      <w:r>
-        <w:t>) ?</w:t>
-      </w:r>
-      <w:proofErr w:type="gramEnd"/>
-      <w:r>
-        <w:t xml:space="preserve"> </w:t>
-      </w:r>
-      <w:proofErr w:type="spellStart"/>
-      <w:r>
-        <w:t>valor_si_</w:t>
-      </w:r>
-      <w:proofErr w:type="gramStart"/>
-      <w:r>
-        <w:t>verdadero</w:t>
-      </w:r>
-      <w:proofErr w:type="spellEnd"/>
-      <w:r>
-        <w:t xml:space="preserve"> :</w:t>
-      </w:r>
-      <w:proofErr w:type="gramEnd"/>
-      <w:r>
-        <w:t xml:space="preserve"> </w:t>
-      </w:r>
-      <w:proofErr w:type="spellStart"/>
-      <w:r>
-        <w:t>valor_si_falso</w:t>
-      </w:r>
-      <w:proofErr w:type="spellEnd"/>
-      <w:r>
-        <w:t>;</w:t>
-      </w:r>
-    </w:p>
-    <w:p>
-      <w:r>
-        <w:rPr>
-          <w:b/>
-          <w:bCs/>
-        </w:rPr>
-        <w:lastRenderedPageBreak/>
-        <w:t>Ejemplo:</w:t>
-      </w:r>
-    </w:p>
-    <w:p>
-      <w:r>
-        <w:t>$edad = 18;</w:t>
-      </w:r>
-    </w:p>
-    <w:p>
-      <w:r>
-        <w:t>$mensaje = ($edad &gt;= 18</w:t>
-      </w:r>
-      <w:proofErr w:type="gramStart"/>
-      <w:r>
-        <w:t>) ?</w:t>
-      </w:r>
-      <w:proofErr w:type="gramEnd"/>
-      <w:r>
-        <w:t xml:space="preserve"> "Adulto</w:t>
-      </w:r>
-      <w:proofErr w:type="gramStart"/>
-      <w:r>
-        <w:t>" :</w:t>
-      </w:r>
-      <w:proofErr w:type="gramEnd"/>
-      <w:r>
-        <w:t xml:space="preserve"> "Menor";</w:t>
-      </w:r>
-    </w:p>
-    <w:p>
-      <w:r>
-        <w:t>echo $mensaje;</w:t>
-      </w:r>
-    </w:p>
-    <w:p>
-      <w:r>
-        <w:rPr>
-          <w:rFonts w:ascii="Segoe UI Emoji" w:hAnsi="Segoe UI Emoji" w:cs="Segoe UI Emoji"/>
-        </w:rPr>
-        <w:t>📘</w:t>
-      </w:r>
-      <w:r>
-        <w:t xml:space="preserve"> </w:t>
-      </w:r>
-      <w:r>
-        <w:rPr>
-          <w:i/>
-          <w:iCs/>
-        </w:rPr>
-        <w:t>Salida:</w:t>
-      </w:r>
-      <w:r>
         <w:t xml:space="preserve"> Adulto</w:t>
       </w:r>
     </w:p>
     <w:p>
       <w:r>
         <w:pict w14:anchorId="18A6AA0F">
-          <v:rect id="_x0000_i1165" style="width:0;height:1.5pt" o:hralign="center" o:hrstd="t" o:hr="t" fillcolor="#a0a0a0" stroked="f"/>
+          <v:rect id="_x0000_i1037" style="width:0;height:1.5pt" o:hralign="center" o:hrstd="t" o:hr="t" fillcolor="#a0a0a0" stroked="f"/>
         </w:pict>
       </w:r>
     </w:p>
@@ -4782,13 +4775,13 @@
     <w:p>
       <w:r>
         <w:pict w14:anchorId="4CD6C45C">
-          <v:rect id="_x0000_i1166" style="width:0;height:1.5pt" o:hralign="center" o:hrstd="t" o:hr="t" fillcolor="#a0a0a0" stroked="f"/>
+          <v:rect id="_x0000_i1038" style="width:0;height:1.5pt" o:hralign="center" o:hrstd="t" o:hr="t" fillcolor="#a0a0a0" stroked="f"/>
         </w:pict>
       </w:r>
     </w:p>
     <w:p>
       <w:pPr>
-        <w:pStyle w:val="Ttulo2"/>
+        <w:pStyle w:val="Ttulo1"/>
       </w:pPr>
       <w:r>
         <w:rPr>
@@ -4818,7 +4811,7 @@
     <w:p>
       <w:r>
         <w:pict w14:anchorId="6637DF20">
-          <v:rect id="_x0000_i1167" style="width:0;height:1.5pt" o:hralign="center" o:hrstd="t" o:hr="t" fillcolor="#a0a0a0" stroked="f"/>
+          <v:rect id="_x0000_i1039" style="width:0;height:1.5pt" o:hralign="center" o:hrstd="t" o:hr="t" fillcolor="#a0a0a0" stroked="f"/>
         </w:pict>
       </w:r>
     </w:p>
@@ -4950,7 +4943,7 @@
     <w:p>
       <w:r>
         <w:pict w14:anchorId="0877C970">
-          <v:rect id="_x0000_i1168" style="width:0;height:1.5pt" o:hralign="center" o:hrstd="t" o:hr="t" fillcolor="#a0a0a0" stroked="f"/>
+          <v:rect id="_x0000_i1040" style="width:0;height:1.5pt" o:hralign="center" o:hrstd="t" o:hr="t" fillcolor="#a0a0a0" stroked="f"/>
         </w:pict>
       </w:r>
     </w:p>
@@ -5092,7 +5085,7 @@
     <w:p>
       <w:r>
         <w:pict w14:anchorId="767775FF">
-          <v:rect id="_x0000_i1169" style="width:0;height:1.5pt" o:hralign="center" o:hrstd="t" o:hr="t" fillcolor="#a0a0a0" stroked="f"/>
+          <v:rect id="_x0000_i1041" style="width:0;height:1.5pt" o:hralign="center" o:hrstd="t" o:hr="t" fillcolor="#a0a0a0" stroked="f"/>
         </w:pict>
       </w:r>
     </w:p>
@@ -5284,7 +5277,7 @@
     <w:p>
       <w:r>
         <w:pict w14:anchorId="5FF6AD33">
-          <v:rect id="_x0000_i1170" style="width:0;height:1.5pt" o:hralign="center" o:hrstd="t" o:hr="t" fillcolor="#a0a0a0" stroked="f"/>
+          <v:rect id="_x0000_i1042" style="width:0;height:1.5pt" o:hralign="center" o:hrstd="t" o:hr="t" fillcolor="#a0a0a0" stroked="f"/>
         </w:pict>
       </w:r>
     </w:p>
@@ -5492,7 +5485,7 @@
     <w:p>
       <w:r>
         <w:pict w14:anchorId="155F5738">
-          <v:rect id="_x0000_i1171" style="width:0;height:1.5pt" o:hralign="center" o:hrstd="t" o:hr="t" fillcolor="#a0a0a0" stroked="f"/>
+          <v:rect id="_x0000_i1043" style="width:0;height:1.5pt" o:hralign="center" o:hrstd="t" o:hr="t" fillcolor="#a0a0a0" stroked="f"/>
         </w:pict>
       </w:r>
     </w:p>
@@ -5727,7 +5720,7 @@
     <w:p>
       <w:r>
         <w:pict w14:anchorId="05A1C315">
-          <v:rect id="_x0000_i1172" style="width:0;height:1.5pt" o:hralign="center" o:hrstd="t" o:hr="t" fillcolor="#a0a0a0" stroked="f"/>
+          <v:rect id="_x0000_i1044" style="width:0;height:1.5pt" o:hralign="center" o:hrstd="t" o:hr="t" fillcolor="#a0a0a0" stroked="f"/>
         </w:pict>
       </w:r>
     </w:p>
@@ -5958,6 +5951,110 @@
         <w:t>7 es impar</w:t>
       </w:r>
     </w:p>
+    <w:p>
+      <w:pPr>
+        <w:pStyle w:val="Ttulo1"/>
+      </w:pPr>
+      <w:r>
+        <w:t>Herencia</w:t>
+      </w:r>
+    </w:p>
+    <w:p>
+      <w:r>
+        <w:t xml:space="preserve">La herencia es un mecanismo de la programación orientada a objetos que permite crear nuevas clases a partir de otras ya existentes. Una clase hija (o subclase) puede recibir atributos y métodos de una clase padre (o superclase), lo que evita repetir código y facilita la organización del sistema. Gracias a la herencia, es posible construir jerarquías lógicas como “Animal → Perro → </w:t>
+      </w:r>
+      <w:proofErr w:type="spellStart"/>
+      <w:r>
+        <w:t>PerroPastor</w:t>
+      </w:r>
+      <w:proofErr w:type="spellEnd"/>
+      <w:r>
+        <w:t>”, donde cada nivel añade nuevas características sin perder las anteriores.</w:t>
+      </w:r>
+    </w:p>
+    <w:p>
+      <w:r>
+        <w:pict w14:anchorId="206CE0BA">
+          <v:rect id="_x0000_i1069" style="width:0;height:1.5pt" o:hralign="center" o:hrstd="t" o:hr="t" fillcolor="#a0a0a0" stroked="f"/>
+        </w:pict>
+      </w:r>
+    </w:p>
+    <w:p>
+      <w:pPr>
+        <w:pStyle w:val="Ttulo1"/>
+      </w:pPr>
+      <w:r>
+        <w:lastRenderedPageBreak/>
+        <w:t>Polimorfismo</w:t>
+      </w:r>
+    </w:p>
+    <w:p>
+      <w:r>
+        <w:t>El polimorfismo permite que un mismo método o acción se comporte de manera diferente según el objeto que lo utilice. En otras palabras, una misma instrucción puede generar resultados distintos dependiendo del tipo de objeto que la ejecute. Esto es útil cuando varias clases comparten métodos con el mismo nombre, pero cada una lo implementa con su propio comportamiento, facilitando que el código sea flexible y adaptable.</w:t>
+      </w:r>
+    </w:p>
+    <w:p>
+      <w:r>
+        <w:pict w14:anchorId="0BF60089">
+          <v:rect id="_x0000_i1070" style="width:0;height:1.5pt" o:hralign="center" o:hrstd="t" o:hr="t" fillcolor="#a0a0a0" stroked="f"/>
+        </w:pict>
+      </w:r>
+    </w:p>
+    <w:p>
+      <w:pPr>
+        <w:pStyle w:val="Ttulo1"/>
+      </w:pPr>
+      <w:r>
+        <w:t>Abstracción</w:t>
+      </w:r>
+    </w:p>
+    <w:p>
+      <w:r>
+        <w:t>La abstracción consiste en concentrarse solo en las características esenciales de un objeto, ocultando detalles complejos que no son necesarios para el usuario. Se logra mediante clases abstractas o interfaces, donde se definen funciones importantes sin mostrar cómo se implementan. Este concepto permite crear modelos más claros, modularizar el sistema y evitar que el programador tenga que preocuparse por procesos internos innecesarios.</w:t>
+      </w:r>
+    </w:p>
+    <w:p>
+      <w:r>
+        <w:pict w14:anchorId="777F4DC0">
+          <v:rect id="_x0000_i1071" style="width:0;height:1.5pt" o:hralign="center" o:hrstd="t" o:hr="t" fillcolor="#a0a0a0" stroked="f"/>
+        </w:pict>
+      </w:r>
+    </w:p>
+    <w:p>
+      <w:pPr>
+        <w:pStyle w:val="Ttulo1"/>
+      </w:pPr>
+      <w:r>
+        <w:t>Sobrecarga de métodos</w:t>
+      </w:r>
+    </w:p>
+    <w:p>
+      <w:r>
+        <w:t>La sobrecarga de métodos ocurre cuando en una misma clase existen varios métodos con el mismo nombre, pero con parámetros diferentes (cantidad o tipo). El programa decide cuál método ejecutar según los argumentos que se envíen. Esto facilita la legibilidad y permite ofrecer distintas formas de realizar una misma acción. Por ejemplo: un método “calcular” puede funcionar para sumar enteros, decimales o incluso listas, dependiendo de cómo se llame.</w:t>
+      </w:r>
+    </w:p>
+    <w:p>
+      <w:r>
+        <w:pict w14:anchorId="69D6B19D">
+          <v:rect id="_x0000_i1072" style="width:0;height:1.5pt" o:hralign="center" o:hrstd="t" o:hr="t" fillcolor="#a0a0a0" stroked="f"/>
+        </w:pict>
+      </w:r>
+    </w:p>
+    <w:p>
+      <w:pPr>
+        <w:pStyle w:val="Ttulo1"/>
+      </w:pPr>
+      <w:r>
+        <w:lastRenderedPageBreak/>
+        <w:t>Redacción integrada</w:t>
+      </w:r>
+    </w:p>
+    <w:p>
+      <w:r>
+        <w:t>La programación orientada a objetos se basa en conceptos fundamentales que permiten crear sistemas organizados, reutilizables y fáciles de mantener. La herencia permite construir nuevas clases a partir de otras, compartiendo atributos y comportamientos para evitar duplicar código. El polimorfismo amplía esta idea al permitir que un mismo método actúe de forma distinta según el objeto que lo utilice, logrando mayor flexibilidad. La abstracción ayuda a centrarse en lo más importante de un objeto, ocultando detalles técnicos y ofreciendo una visión más limpia del sistema. Por su parte, la sobrecarga de métodos brinda la posibilidad de usar el mismo nombre para varias funciones que realizan tareas similares, siempre que difieran en sus parámetros. En conjunto, estos principios hacen posible desarrollar software más claro, modular y escalable.</w:t>
+      </w:r>
+    </w:p>
+    <w:p/>
     <w:p/>
     <w:p>
       <w:pPr>
@@ -10535,28 +10632,28 @@
 </file>
 
 <file path=customXml/item1.xml><?xml version="1.0" encoding="utf-8"?>
+<b:Sources xmlns:b="http://schemas.openxmlformats.org/officeDocument/2006/bibliography" xmlns="http://schemas.openxmlformats.org/officeDocument/2006/bibliography" SelectedStyle="\APASixthEditionOfficeOnline.xsl" StyleName="APA" Version="6"/>
+</file>
+
+<file path=customXml/item2.xml><?xml version="1.0" encoding="utf-8"?>
 <go:gDocsCustomXmlDataStorage xmlns:go="http://customooxmlschemas.google.com/" xmlns:r="http://schemas.openxmlformats.org/officeDocument/2006/relationships" uri="GoogleDocsCustomDataVersion2">
   <go:docsCustomData xmlns:go="http://customooxmlschemas.google.com/" roundtripDataSignature="AMtx7mgjIi8mV/ll7RC7RGGXrONUlBLqNw==">CgMxLjAyDmgubjZ6NWc0dTI2b2kzMg5oLm9mYTFhemt2NXJhbTIOaC45YXdpd2prZWp5YmMyDmguaWwwMTZiMnQzYXMzMg5oLjY3eXl2dTdkdmFuYTgAciExbk1zQVJYN1ZyVTR2b0Joc1hRSmY1enRLM2JXWVhrZDU=</go:docsCustomData>
 </go:gDocsCustomXmlDataStorage>
 </file>
 
-<file path=customXml/item2.xml><?xml version="1.0" encoding="utf-8"?>
-<b:Sources xmlns:b="http://schemas.openxmlformats.org/officeDocument/2006/bibliography" xmlns="http://schemas.openxmlformats.org/officeDocument/2006/bibliography" SelectedStyle="\APASixthEditionOfficeOnline.xsl" StyleName="APA" Version="6"/>
+<file path=customXml/itemProps1.xml><?xml version="1.0" encoding="utf-8"?>
+<ds:datastoreItem xmlns:ds="http://schemas.openxmlformats.org/officeDocument/2006/customXml" ds:itemID="{2EC9EC03-D02E-4056-A37D-CA6E9DCD92DB}">
+  <ds:schemaRefs>
+    <ds:schemaRef ds:uri="http://schemas.openxmlformats.org/officeDocument/2006/bibliography"/>
+  </ds:schemaRefs>
+</ds:datastoreItem>
 </file>
 
-<file path=customXml/itemProps1.xml><?xml version="1.0" encoding="utf-8"?>
+<file path=customXml/itemProps2.xml><?xml version="1.0" encoding="utf-8"?>
 <ds:datastoreItem xmlns:ds="http://schemas.openxmlformats.org/officeDocument/2006/customXml" ds:itemID="{11111111-1234-1234-1234-123412341234}">
   <ds:schemaRefs>
     <ds:schemaRef ds:uri="http://customooxmlschemas.google.com/"/>
     <ds:schemaRef ds:uri="http://schemas.openxmlformats.org/officeDocument/2006/relationships"/>
   </ds:schemaRefs>
 </ds:datastoreItem>
-</file>
-
-<file path=customXml/itemProps2.xml><?xml version="1.0" encoding="utf-8"?>
-<ds:datastoreItem xmlns:ds="http://schemas.openxmlformats.org/officeDocument/2006/customXml" ds:itemID="{2EC9EC03-D02E-4056-A37D-CA6E9DCD92DB}">
-  <ds:schemaRefs>
-    <ds:schemaRef ds:uri="http://schemas.openxmlformats.org/officeDocument/2006/bibliography"/>
-  </ds:schemaRefs>
-</ds:datastoreItem>
 </file>
</xml_diff>

<commit_message>
Descripción de los cambios realizados
</commit_message>
<xml_diff>
--- a/Diccionario Jair.docx
+++ b/Diccionario Jair.docx
@@ -5975,7 +5975,7 @@
     <w:p>
       <w:r>
         <w:pict w14:anchorId="206CE0BA">
-          <v:rect id="_x0000_i1069" style="width:0;height:1.5pt" o:hralign="center" o:hrstd="t" o:hr="t" fillcolor="#a0a0a0" stroked="f"/>
+          <v:rect id="_x0000_i1045" style="width:0;height:1.5pt" o:hralign="center" o:hrstd="t" o:hr="t" fillcolor="#a0a0a0" stroked="f"/>
         </w:pict>
       </w:r>
     </w:p>
@@ -5996,7 +5996,7 @@
     <w:p>
       <w:r>
         <w:pict w14:anchorId="0BF60089">
-          <v:rect id="_x0000_i1070" style="width:0;height:1.5pt" o:hralign="center" o:hrstd="t" o:hr="t" fillcolor="#a0a0a0" stroked="f"/>
+          <v:rect id="_x0000_i1046" style="width:0;height:1.5pt" o:hralign="center" o:hrstd="t" o:hr="t" fillcolor="#a0a0a0" stroked="f"/>
         </w:pict>
       </w:r>
     </w:p>
@@ -6016,7 +6016,7 @@
     <w:p>
       <w:r>
         <w:pict w14:anchorId="777F4DC0">
-          <v:rect id="_x0000_i1071" style="width:0;height:1.5pt" o:hralign="center" o:hrstd="t" o:hr="t" fillcolor="#a0a0a0" stroked="f"/>
+          <v:rect id="_x0000_i1047" style="width:0;height:1.5pt" o:hralign="center" o:hrstd="t" o:hr="t" fillcolor="#a0a0a0" stroked="f"/>
         </w:pict>
       </w:r>
     </w:p>
@@ -6036,7 +6036,7 @@
     <w:p>
       <w:r>
         <w:pict w14:anchorId="69D6B19D">
-          <v:rect id="_x0000_i1072" style="width:0;height:1.5pt" o:hralign="center" o:hrstd="t" o:hr="t" fillcolor="#a0a0a0" stroked="f"/>
+          <v:rect id="_x0000_i1048" style="width:0;height:1.5pt" o:hralign="center" o:hrstd="t" o:hr="t" fillcolor="#a0a0a0" stroked="f"/>
         </w:pict>
       </w:r>
     </w:p>
@@ -6052,6 +6052,787 @@
     <w:p>
       <w:r>
         <w:t>La programación orientada a objetos se basa en conceptos fundamentales que permiten crear sistemas organizados, reutilizables y fáciles de mantener. La herencia permite construir nuevas clases a partir de otras, compartiendo atributos y comportamientos para evitar duplicar código. El polimorfismo amplía esta idea al permitir que un mismo método actúe de forma distinta según el objeto que lo utilice, logrando mayor flexibilidad. La abstracción ayuda a centrarse en lo más importante de un objeto, ocultando detalles técnicos y ofreciendo una visión más limpia del sistema. Por su parte, la sobrecarga de métodos brinda la posibilidad de usar el mismo nombre para varias funciones que realizan tareas similares, siempre que difieran en sus parámetros. En conjunto, estos principios hacen posible desarrollar software más claro, modular y escalable.</w:t>
+      </w:r>
+    </w:p>
+    <w:p>
+      <w:pPr>
+        <w:pStyle w:val="Ttulo1"/>
+      </w:pPr>
+      <w:r>
+        <w:t>Patrones de Diseño Arquitectónico</w:t>
+      </w:r>
+    </w:p>
+    <w:p>
+      <w:r>
+        <w:t>Los patrones de diseño arquitectónico constituyen soluciones estandarizadas, probadas y ampliamente aceptadas para problemas recurrentes en el desarrollo de software. Estas estructuras conceptuales no representan fragmentos de código, sino enfoques organizados que permiten construir sistemas más eficientes, flexibles y escalables. Su objetivo central es mejorar la calidad del software a través de la reducción del acoplamiento, la reutilización de componentes y la claridad en la comunicación entre desarrolladores.</w:t>
+      </w:r>
+    </w:p>
+    <w:p>
+      <w:r>
+        <w:pict w14:anchorId="37E9405C">
+          <v:rect id="_x0000_i1121" style="width:0;height:1.5pt" o:hralign="center" o:hrstd="t" o:hr="t" fillcolor="#a0a0a0" stroked="f"/>
+        </w:pict>
+      </w:r>
+    </w:p>
+    <w:p>
+      <w:pPr>
+        <w:pStyle w:val="Ttulo2"/>
+      </w:pPr>
+      <w:r>
+        <w:t>1. Patrones Creacionales</w:t>
+      </w:r>
+    </w:p>
+    <w:p>
+      <w:r>
+        <w:t xml:space="preserve">Los patrones creacionales se enfocan en los mecanismos de creación de objetos dentro de un sistema. Su propósito es controlar y optimizar la forma en que los objetos son instanciados, </w:t>
+      </w:r>
+      <w:r>
+        <w:lastRenderedPageBreak/>
+        <w:t>evitando la dependencia directa entre clases y favoreciendo la generación flexible y ordenada de instancias.</w:t>
+      </w:r>
+    </w:p>
+    <w:p>
+      <w:pPr>
+        <w:rPr>
+          <w:b/>
+          <w:bCs/>
+        </w:rPr>
+      </w:pPr>
+      <w:r>
+        <w:rPr>
+          <w:b/>
+          <w:bCs/>
+        </w:rPr>
+        <w:t>Funciones y utilidad</w:t>
+      </w:r>
+    </w:p>
+    <w:p>
+      <w:pPr>
+        <w:numPr>
+          <w:ilvl w:val="0"/>
+          <w:numId w:val="27"/>
+        </w:numPr>
+      </w:pPr>
+      <w:r>
+        <w:t>Facilitan la creación de objetos complejos.</w:t>
+      </w:r>
+    </w:p>
+    <w:p>
+      <w:pPr>
+        <w:numPr>
+          <w:ilvl w:val="0"/>
+          <w:numId w:val="27"/>
+        </w:numPr>
+      </w:pPr>
+      <w:r>
+        <w:t>Reducen el acoplamiento entre clases.</w:t>
+      </w:r>
+    </w:p>
+    <w:p>
+      <w:pPr>
+        <w:numPr>
+          <w:ilvl w:val="0"/>
+          <w:numId w:val="27"/>
+        </w:numPr>
+      </w:pPr>
+      <w:r>
+        <w:t>Permiten instanciar objetos de manera controlada y adaptable al contexto.</w:t>
+      </w:r>
+    </w:p>
+    <w:p>
+      <w:pPr>
+        <w:rPr>
+          <w:b/>
+          <w:bCs/>
+        </w:rPr>
+      </w:pPr>
+      <w:r>
+        <w:rPr>
+          <w:b/>
+          <w:bCs/>
+        </w:rPr>
+        <w:t>Principales patrones creacionales</w:t>
+      </w:r>
+    </w:p>
+    <w:p>
+      <w:pPr>
+        <w:numPr>
+          <w:ilvl w:val="0"/>
+          <w:numId w:val="28"/>
+        </w:numPr>
+      </w:pPr>
+      <w:proofErr w:type="spellStart"/>
+      <w:r>
+        <w:rPr>
+          <w:b/>
+          <w:bCs/>
+        </w:rPr>
+        <w:t>Singleton</w:t>
+      </w:r>
+      <w:proofErr w:type="spellEnd"/>
+      <w:r>
+        <w:t>: Garantiza que una clase posea una única instancia global, útil para componentes como gestores de configuración o controladores de base de datos.</w:t>
+      </w:r>
+    </w:p>
+    <w:p>
+      <w:pPr>
+        <w:numPr>
+          <w:ilvl w:val="0"/>
+          <w:numId w:val="28"/>
+        </w:numPr>
+      </w:pPr>
+      <w:r>
+        <w:rPr>
+          <w:b/>
+          <w:bCs/>
+        </w:rPr>
+        <w:t xml:space="preserve">Factory </w:t>
+      </w:r>
+      <w:proofErr w:type="spellStart"/>
+      <w:r>
+        <w:rPr>
+          <w:b/>
+          <w:bCs/>
+        </w:rPr>
+        <w:t>Method</w:t>
+      </w:r>
+      <w:proofErr w:type="spellEnd"/>
+      <w:r>
+        <w:t>: Define un método para crear objetos sin especificar la clase concreta, permitiendo delegar la instanciación.</w:t>
+      </w:r>
+    </w:p>
+    <w:p>
+      <w:pPr>
+        <w:numPr>
+          <w:ilvl w:val="0"/>
+          <w:numId w:val="28"/>
+        </w:numPr>
+      </w:pPr>
+      <w:proofErr w:type="spellStart"/>
+      <w:r>
+        <w:rPr>
+          <w:b/>
+          <w:bCs/>
+        </w:rPr>
+        <w:t>Abstract</w:t>
+      </w:r>
+      <w:proofErr w:type="spellEnd"/>
+      <w:r>
+        <w:rPr>
+          <w:b/>
+          <w:bCs/>
+        </w:rPr>
+        <w:t xml:space="preserve"> Factory</w:t>
+      </w:r>
+      <w:r>
+        <w:t>: Permite crear familias de objetos relacionados sin exponer directamente sus implementaciones.</w:t>
+      </w:r>
+    </w:p>
+    <w:p>
+      <w:pPr>
+        <w:numPr>
+          <w:ilvl w:val="0"/>
+          <w:numId w:val="28"/>
+        </w:numPr>
+      </w:pPr>
+      <w:proofErr w:type="spellStart"/>
+      <w:r>
+        <w:rPr>
+          <w:b/>
+          <w:bCs/>
+        </w:rPr>
+        <w:t>Builder</w:t>
+      </w:r>
+      <w:proofErr w:type="spellEnd"/>
+      <w:r>
+        <w:t>: Facilita la construcción de objetos complejos mediante pasos definidos, especialmente útil cuando un objeto requiere múltiples configuraciones.</w:t>
+      </w:r>
+    </w:p>
+    <w:p>
+      <w:pPr>
+        <w:numPr>
+          <w:ilvl w:val="0"/>
+          <w:numId w:val="28"/>
+        </w:numPr>
+      </w:pPr>
+      <w:proofErr w:type="spellStart"/>
+      <w:r>
+        <w:rPr>
+          <w:b/>
+          <w:bCs/>
+        </w:rPr>
+        <w:t>Prototype</w:t>
+      </w:r>
+      <w:proofErr w:type="spellEnd"/>
+      <w:r>
+        <w:t>: Crea nuevos objetos mediante la clonación de instancias existentes, optimizando la multiplicación de estructuras similares.</w:t>
+      </w:r>
+    </w:p>
+    <w:p>
+      <w:r>
+        <w:pict w14:anchorId="0A56DD58">
+          <v:rect id="_x0000_i1122" style="width:0;height:1.5pt" o:hralign="center" o:hrstd="t" o:hr="t" fillcolor="#a0a0a0" stroked="f"/>
+        </w:pict>
+      </w:r>
+    </w:p>
+    <w:p>
+      <w:pPr>
+        <w:pStyle w:val="Ttulo2"/>
+      </w:pPr>
+      <w:r>
+        <w:t>2. Patrones Estructurales</w:t>
+      </w:r>
+    </w:p>
+    <w:p>
+      <w:r>
+        <w:t>Los patrones estructurales se centran en la composición y organización de clases y objetos para formar estructuras más robustas. Su finalidad es establecer relaciones claras y flexibles que permitan ampliar o modificar un sistema sin afectar su funcionamiento general.</w:t>
+      </w:r>
+    </w:p>
+    <w:p>
+      <w:pPr>
+        <w:rPr>
+          <w:b/>
+          <w:bCs/>
+        </w:rPr>
+      </w:pPr>
+      <w:r>
+        <w:rPr>
+          <w:b/>
+          <w:bCs/>
+        </w:rPr>
+        <w:lastRenderedPageBreak/>
+        <w:t>Funciones y utilidad</w:t>
+      </w:r>
+    </w:p>
+    <w:p>
+      <w:pPr>
+        <w:numPr>
+          <w:ilvl w:val="0"/>
+          <w:numId w:val="29"/>
+        </w:numPr>
+      </w:pPr>
+      <w:r>
+        <w:t>Mejoran la integración entre múltiples componentes.</w:t>
+      </w:r>
+    </w:p>
+    <w:p>
+      <w:pPr>
+        <w:numPr>
+          <w:ilvl w:val="0"/>
+          <w:numId w:val="29"/>
+        </w:numPr>
+      </w:pPr>
+      <w:r>
+        <w:t>Facilitan la construcción de estructuras complejas.</w:t>
+      </w:r>
+    </w:p>
+    <w:p>
+      <w:pPr>
+        <w:numPr>
+          <w:ilvl w:val="0"/>
+          <w:numId w:val="29"/>
+        </w:numPr>
+      </w:pPr>
+      <w:r>
+        <w:t>Permiten extender funcionalidades sin realizar cambios drásticos.</w:t>
+      </w:r>
+    </w:p>
+    <w:p>
+      <w:pPr>
+        <w:rPr>
+          <w:b/>
+          <w:bCs/>
+        </w:rPr>
+      </w:pPr>
+      <w:r>
+        <w:rPr>
+          <w:b/>
+          <w:bCs/>
+        </w:rPr>
+        <w:t>Principales patrones estructurales</w:t>
+      </w:r>
+    </w:p>
+    <w:p>
+      <w:pPr>
+        <w:numPr>
+          <w:ilvl w:val="0"/>
+          <w:numId w:val="30"/>
+        </w:numPr>
+      </w:pPr>
+      <w:proofErr w:type="spellStart"/>
+      <w:r>
+        <w:rPr>
+          <w:b/>
+          <w:bCs/>
+        </w:rPr>
+        <w:t>Adapter</w:t>
+      </w:r>
+      <w:proofErr w:type="spellEnd"/>
+      <w:r>
+        <w:t>: Permite la comunicación entre clases que originalmente no son compatibles, actuando como un intermediario.</w:t>
+      </w:r>
+    </w:p>
+    <w:p>
+      <w:pPr>
+        <w:numPr>
+          <w:ilvl w:val="0"/>
+          <w:numId w:val="30"/>
+        </w:numPr>
+      </w:pPr>
+      <w:proofErr w:type="spellStart"/>
+      <w:r>
+        <w:rPr>
+          <w:b/>
+          <w:bCs/>
+        </w:rPr>
+        <w:t>Facade</w:t>
+      </w:r>
+      <w:proofErr w:type="spellEnd"/>
+      <w:r>
+        <w:t>: Proporciona una interfaz simplificada para acceder a sistemas complejos o múltiples subsistemas.</w:t>
+      </w:r>
+    </w:p>
+    <w:p>
+      <w:pPr>
+        <w:numPr>
+          <w:ilvl w:val="0"/>
+          <w:numId w:val="30"/>
+        </w:numPr>
+      </w:pPr>
+      <w:r>
+        <w:rPr>
+          <w:b/>
+          <w:bCs/>
+        </w:rPr>
+        <w:t>Composite</w:t>
+      </w:r>
+      <w:r>
+        <w:t>: Permite tratar objetos individuales y colecciones de manera uniforme, ideal para jerarquías como árboles o carpetas.</w:t>
+      </w:r>
+    </w:p>
+    <w:p>
+      <w:pPr>
+        <w:numPr>
+          <w:ilvl w:val="0"/>
+          <w:numId w:val="30"/>
+        </w:numPr>
+      </w:pPr>
+      <w:proofErr w:type="spellStart"/>
+      <w:r>
+        <w:rPr>
+          <w:b/>
+          <w:bCs/>
+        </w:rPr>
+        <w:t>Decorator</w:t>
+      </w:r>
+      <w:proofErr w:type="spellEnd"/>
+      <w:r>
+        <w:t>: Añade funcionalidades adicionales a un objeto sin modificar su estructura interna.</w:t>
+      </w:r>
+    </w:p>
+    <w:p>
+      <w:pPr>
+        <w:numPr>
+          <w:ilvl w:val="0"/>
+          <w:numId w:val="30"/>
+        </w:numPr>
+      </w:pPr>
+      <w:r>
+        <w:rPr>
+          <w:b/>
+          <w:bCs/>
+        </w:rPr>
+        <w:t>Bridge</w:t>
+      </w:r>
+      <w:r>
+        <w:t>: Separa la abstracción de su implementación, permitiendo que ambas evolucionen de forma independiente.</w:t>
+      </w:r>
+    </w:p>
+    <w:p>
+      <w:pPr>
+        <w:numPr>
+          <w:ilvl w:val="0"/>
+          <w:numId w:val="30"/>
+        </w:numPr>
+      </w:pPr>
+      <w:r>
+        <w:rPr>
+          <w:b/>
+          <w:bCs/>
+        </w:rPr>
+        <w:t>Proxy</w:t>
+      </w:r>
+      <w:r>
+        <w:t>: Controla el acceso a un objeto real, pudiendo agregar funciones como seguridad, caché o carga diferida.</w:t>
+      </w:r>
+    </w:p>
+    <w:p>
+      <w:pPr>
+        <w:numPr>
+          <w:ilvl w:val="0"/>
+          <w:numId w:val="30"/>
+        </w:numPr>
+      </w:pPr>
+      <w:proofErr w:type="spellStart"/>
+      <w:r>
+        <w:rPr>
+          <w:b/>
+          <w:bCs/>
+        </w:rPr>
+        <w:t>Flyweight</w:t>
+      </w:r>
+      <w:proofErr w:type="spellEnd"/>
+      <w:r>
+        <w:t>: Optimiza el uso de memoria compartiendo objetos repetidos de manera eficiente.</w:t>
+      </w:r>
+    </w:p>
+    <w:p>
+      <w:r>
+        <w:pict w14:anchorId="41763D3B">
+          <v:rect id="_x0000_i1123" style="width:0;height:1.5pt" o:hralign="center" o:hrstd="t" o:hr="t" fillcolor="#a0a0a0" stroked="f"/>
+        </w:pict>
+      </w:r>
+    </w:p>
+    <w:p>
+      <w:pPr>
+        <w:pStyle w:val="Ttulo2"/>
+      </w:pPr>
+      <w:r>
+        <w:lastRenderedPageBreak/>
+        <w:t>3. Patrones de Comportamiento</w:t>
+      </w:r>
+    </w:p>
+    <w:p>
+      <w:r>
+        <w:t>Los patrones de comportamiento describen la manera en que los objetos interactúan entre sí y cómo distribuyen responsabilidades dentro de un sistema. Su enfoque radica en regular el flujo de comunicación para mejorar la flexibilidad y facilitar la extensión del software.</w:t>
+      </w:r>
+    </w:p>
+    <w:p>
+      <w:pPr>
+        <w:rPr>
+          <w:b/>
+          <w:bCs/>
+        </w:rPr>
+      </w:pPr>
+      <w:r>
+        <w:rPr>
+          <w:b/>
+          <w:bCs/>
+        </w:rPr>
+        <w:t>Funciones y utilidad</w:t>
+      </w:r>
+    </w:p>
+    <w:p>
+      <w:pPr>
+        <w:numPr>
+          <w:ilvl w:val="0"/>
+          <w:numId w:val="31"/>
+        </w:numPr>
+      </w:pPr>
+      <w:r>
+        <w:t>Regulan la comunicación entre objetos.</w:t>
+      </w:r>
+    </w:p>
+    <w:p>
+      <w:pPr>
+        <w:numPr>
+          <w:ilvl w:val="0"/>
+          <w:numId w:val="31"/>
+        </w:numPr>
+      </w:pPr>
+      <w:r>
+        <w:t>Facilitan la modificación del comportamiento de un sistema sin alterar su estructura.</w:t>
+      </w:r>
+    </w:p>
+    <w:p>
+      <w:pPr>
+        <w:numPr>
+          <w:ilvl w:val="0"/>
+          <w:numId w:val="31"/>
+        </w:numPr>
+      </w:pPr>
+      <w:r>
+        <w:t>Mejoran la organización del flujo lógico interno del software.</w:t>
+      </w:r>
+    </w:p>
+    <w:p>
+      <w:pPr>
+        <w:rPr>
+          <w:b/>
+          <w:bCs/>
+        </w:rPr>
+      </w:pPr>
+      <w:r>
+        <w:rPr>
+          <w:b/>
+          <w:bCs/>
+        </w:rPr>
+        <w:t>Principales patrones de comportamiento</w:t>
+      </w:r>
+    </w:p>
+    <w:p>
+      <w:pPr>
+        <w:numPr>
+          <w:ilvl w:val="0"/>
+          <w:numId w:val="32"/>
+        </w:numPr>
+      </w:pPr>
+      <w:proofErr w:type="spellStart"/>
+      <w:r>
+        <w:rPr>
+          <w:b/>
+          <w:bCs/>
+        </w:rPr>
+        <w:t>Observer</w:t>
+      </w:r>
+      <w:proofErr w:type="spellEnd"/>
+      <w:r>
+        <w:t>: Establece un mecanismo de notificación automática a múltiples objetos cuando el estado de otro cambia.</w:t>
+      </w:r>
+    </w:p>
+    <w:p>
+      <w:pPr>
+        <w:numPr>
+          <w:ilvl w:val="0"/>
+          <w:numId w:val="32"/>
+        </w:numPr>
+      </w:pPr>
+      <w:proofErr w:type="spellStart"/>
+      <w:r>
+        <w:rPr>
+          <w:b/>
+          <w:bCs/>
+        </w:rPr>
+        <w:t>Strategy</w:t>
+      </w:r>
+      <w:proofErr w:type="spellEnd"/>
+      <w:r>
+        <w:t>: Define un conjunto de algoritmos intercambiables que pueden seleccionarse en tiempo de ejecución.</w:t>
+      </w:r>
+    </w:p>
+    <w:p>
+      <w:pPr>
+        <w:numPr>
+          <w:ilvl w:val="0"/>
+          <w:numId w:val="32"/>
+        </w:numPr>
+      </w:pPr>
+      <w:proofErr w:type="spellStart"/>
+      <w:r>
+        <w:rPr>
+          <w:b/>
+          <w:bCs/>
+        </w:rPr>
+        <w:t>Command</w:t>
+      </w:r>
+      <w:proofErr w:type="spellEnd"/>
+      <w:r>
+        <w:t>: Representa acciones como objetos, permitiendo funcionalidades como deshacer, rehacer o encolar tareas.</w:t>
+      </w:r>
+    </w:p>
+    <w:p>
+      <w:pPr>
+        <w:numPr>
+          <w:ilvl w:val="0"/>
+          <w:numId w:val="32"/>
+        </w:numPr>
+      </w:pPr>
+      <w:proofErr w:type="spellStart"/>
+      <w:r>
+        <w:rPr>
+          <w:b/>
+          <w:bCs/>
+        </w:rPr>
+        <w:t>Iterator</w:t>
+      </w:r>
+      <w:proofErr w:type="spellEnd"/>
+      <w:r>
+        <w:t>: Permite recorrer colecciones sin exponer su estructura interna.</w:t>
+      </w:r>
+    </w:p>
+    <w:p>
+      <w:pPr>
+        <w:numPr>
+          <w:ilvl w:val="0"/>
+          <w:numId w:val="32"/>
+        </w:numPr>
+      </w:pPr>
+      <w:proofErr w:type="spellStart"/>
+      <w:r>
+        <w:rPr>
+          <w:b/>
+          <w:bCs/>
+        </w:rPr>
+        <w:t>State</w:t>
+      </w:r>
+      <w:proofErr w:type="spellEnd"/>
+      <w:r>
+        <w:t>: Modifica el comportamiento de una clase según su estado interno, útil para máquinas de estados.</w:t>
+      </w:r>
+    </w:p>
+    <w:p>
+      <w:pPr>
+        <w:numPr>
+          <w:ilvl w:val="0"/>
+          <w:numId w:val="32"/>
+        </w:numPr>
+      </w:pPr>
+      <w:proofErr w:type="spellStart"/>
+      <w:r>
+        <w:rPr>
+          <w:b/>
+          <w:bCs/>
+        </w:rPr>
+        <w:t>Template</w:t>
+      </w:r>
+      <w:proofErr w:type="spellEnd"/>
+      <w:r>
+        <w:rPr>
+          <w:b/>
+          <w:bCs/>
+        </w:rPr>
+        <w:t xml:space="preserve"> </w:t>
+      </w:r>
+      <w:proofErr w:type="spellStart"/>
+      <w:r>
+        <w:rPr>
+          <w:b/>
+          <w:bCs/>
+        </w:rPr>
+        <w:t>Method</w:t>
+      </w:r>
+      <w:proofErr w:type="spellEnd"/>
+      <w:r>
+        <w:t>: Establece el esqueleto de un algoritmo y permite que las subclases definan algunos pasos específicos.</w:t>
+      </w:r>
+    </w:p>
+    <w:p>
+      <w:pPr>
+        <w:numPr>
+          <w:ilvl w:val="0"/>
+          <w:numId w:val="32"/>
+        </w:numPr>
+      </w:pPr>
+      <w:r>
+        <w:rPr>
+          <w:b/>
+          <w:bCs/>
+        </w:rPr>
+        <w:t>Mediator</w:t>
+      </w:r>
+      <w:r>
+        <w:t>: Centraliza la comunicación entre objetos para evitar dependencias múltiples y desordenadas.</w:t>
+      </w:r>
+    </w:p>
+    <w:p>
+      <w:pPr>
+        <w:numPr>
+          <w:ilvl w:val="0"/>
+          <w:numId w:val="32"/>
+        </w:numPr>
+      </w:pPr>
+      <w:proofErr w:type="spellStart"/>
+      <w:r>
+        <w:rPr>
+          <w:b/>
+          <w:bCs/>
+        </w:rPr>
+        <w:lastRenderedPageBreak/>
+        <w:t>Chain</w:t>
+      </w:r>
+      <w:proofErr w:type="spellEnd"/>
+      <w:r>
+        <w:rPr>
+          <w:b/>
+          <w:bCs/>
+        </w:rPr>
+        <w:t xml:space="preserve"> </w:t>
+      </w:r>
+      <w:proofErr w:type="spellStart"/>
+      <w:r>
+        <w:rPr>
+          <w:b/>
+          <w:bCs/>
+        </w:rPr>
+        <w:t>of</w:t>
+      </w:r>
+      <w:proofErr w:type="spellEnd"/>
+      <w:r>
+        <w:rPr>
+          <w:b/>
+          <w:bCs/>
+        </w:rPr>
+        <w:t xml:space="preserve"> </w:t>
+      </w:r>
+      <w:proofErr w:type="spellStart"/>
+      <w:r>
+        <w:rPr>
+          <w:b/>
+          <w:bCs/>
+        </w:rPr>
+        <w:t>Responsibility</w:t>
+      </w:r>
+      <w:proofErr w:type="spellEnd"/>
+      <w:r>
+        <w:t>: Envía solicitudes a través de una cadena de receptores hasta que uno pueda atenderla.</w:t>
+      </w:r>
+    </w:p>
+    <w:p>
+      <w:pPr>
+        <w:numPr>
+          <w:ilvl w:val="0"/>
+          <w:numId w:val="32"/>
+        </w:numPr>
+      </w:pPr>
+      <w:r>
+        <w:rPr>
+          <w:b/>
+          <w:bCs/>
+        </w:rPr>
+        <w:t>Memento</w:t>
+      </w:r>
+      <w:r>
+        <w:t>: Permite guardar y restaurar estados anteriores de un objeto sin violar el encapsulamiento.</w:t>
+      </w:r>
+    </w:p>
+    <w:p>
+      <w:pPr>
+        <w:numPr>
+          <w:ilvl w:val="0"/>
+          <w:numId w:val="32"/>
+        </w:numPr>
+      </w:pPr>
+      <w:proofErr w:type="spellStart"/>
+      <w:r>
+        <w:rPr>
+          <w:b/>
+          <w:bCs/>
+        </w:rPr>
+        <w:t>Visitor</w:t>
+      </w:r>
+      <w:proofErr w:type="spellEnd"/>
+      <w:r>
+        <w:t>: Facilita la adición de nuevas operaciones sobre objetos sin modificar sus clases.</w:t>
+      </w:r>
+    </w:p>
+    <w:p>
+      <w:r>
+        <w:pict w14:anchorId="7017C61D">
+          <v:rect id="_x0000_i1124" style="width:0;height:1.5pt" o:hralign="center" o:hrstd="t" o:hr="t" fillcolor="#a0a0a0" stroked="f"/>
+        </w:pict>
+      </w:r>
+    </w:p>
+    <w:p>
+      <w:pPr>
+        <w:pStyle w:val="Ttulo2"/>
+      </w:pPr>
+      <w:r>
+        <w:t>Conclusión</w:t>
+      </w:r>
+    </w:p>
+    <w:p>
+      <w:r>
+        <w:t>Los patrones de diseño arquitectónico son elementos esenciales en la ingeniería de software moderna. Su correcta aplicación ayuda a estructurar sistemas más estables, adaptables y fáciles de mantener. Comprender y utilizar los patrones creacionales, estructurales y de comportamiento permite a los desarrolladores abordar problemas complejos con estrategias claras, optimizadas y respaldadas por la experiencia de la comunidad de desarrollo.</w:t>
       </w:r>
     </w:p>
     <w:p/>
@@ -7915,6 +8696,155 @@
     </w:lvl>
   </w:abstractNum>
   <w:abstractNum w:abstractNumId="13" w15:restartNumberingAfterBreak="0">
+    <w:nsid w:val="39A22E40"/>
+    <w:multiLevelType w:val="multilevel"/>
+    <w:tmpl w:val="FE022DE4"/>
+    <w:lvl w:ilvl="0">
+      <w:start w:val="1"/>
+      <w:numFmt w:val="bullet"/>
+      <w:lvlText w:val=""/>
+      <w:lvlJc w:val="left"/>
+      <w:pPr>
+        <w:tabs>
+          <w:tab w:val="num" w:pos="720"/>
+        </w:tabs>
+        <w:ind w:left="720" w:hanging="360"/>
+      </w:pPr>
+      <w:rPr>
+        <w:rFonts w:ascii="Symbol" w:hAnsi="Symbol" w:hint="default"/>
+        <w:sz w:val="20"/>
+      </w:rPr>
+    </w:lvl>
+    <w:lvl w:ilvl="1" w:tentative="1">
+      <w:start w:val="1"/>
+      <w:numFmt w:val="bullet"/>
+      <w:lvlText w:val="o"/>
+      <w:lvlJc w:val="left"/>
+      <w:pPr>
+        <w:tabs>
+          <w:tab w:val="num" w:pos="1440"/>
+        </w:tabs>
+        <w:ind w:left="1440" w:hanging="360"/>
+      </w:pPr>
+      <w:rPr>
+        <w:rFonts w:ascii="Courier New" w:hAnsi="Courier New" w:hint="default"/>
+        <w:sz w:val="20"/>
+      </w:rPr>
+    </w:lvl>
+    <w:lvl w:ilvl="2" w:tentative="1">
+      <w:start w:val="1"/>
+      <w:numFmt w:val="bullet"/>
+      <w:lvlText w:val=""/>
+      <w:lvlJc w:val="left"/>
+      <w:pPr>
+        <w:tabs>
+          <w:tab w:val="num" w:pos="2160"/>
+        </w:tabs>
+        <w:ind w:left="2160" w:hanging="360"/>
+      </w:pPr>
+      <w:rPr>
+        <w:rFonts w:ascii="Wingdings" w:hAnsi="Wingdings" w:hint="default"/>
+        <w:sz w:val="20"/>
+      </w:rPr>
+    </w:lvl>
+    <w:lvl w:ilvl="3" w:tentative="1">
+      <w:start w:val="1"/>
+      <w:numFmt w:val="bullet"/>
+      <w:lvlText w:val=""/>
+      <w:lvlJc w:val="left"/>
+      <w:pPr>
+        <w:tabs>
+          <w:tab w:val="num" w:pos="2880"/>
+        </w:tabs>
+        <w:ind w:left="2880" w:hanging="360"/>
+      </w:pPr>
+      <w:rPr>
+        <w:rFonts w:ascii="Wingdings" w:hAnsi="Wingdings" w:hint="default"/>
+        <w:sz w:val="20"/>
+      </w:rPr>
+    </w:lvl>
+    <w:lvl w:ilvl="4" w:tentative="1">
+      <w:start w:val="1"/>
+      <w:numFmt w:val="bullet"/>
+      <w:lvlText w:val=""/>
+      <w:lvlJc w:val="left"/>
+      <w:pPr>
+        <w:tabs>
+          <w:tab w:val="num" w:pos="3600"/>
+        </w:tabs>
+        <w:ind w:left="3600" w:hanging="360"/>
+      </w:pPr>
+      <w:rPr>
+        <w:rFonts w:ascii="Wingdings" w:hAnsi="Wingdings" w:hint="default"/>
+        <w:sz w:val="20"/>
+      </w:rPr>
+    </w:lvl>
+    <w:lvl w:ilvl="5" w:tentative="1">
+      <w:start w:val="1"/>
+      <w:numFmt w:val="bullet"/>
+      <w:lvlText w:val=""/>
+      <w:lvlJc w:val="left"/>
+      <w:pPr>
+        <w:tabs>
+          <w:tab w:val="num" w:pos="4320"/>
+        </w:tabs>
+        <w:ind w:left="4320" w:hanging="360"/>
+      </w:pPr>
+      <w:rPr>
+        <w:rFonts w:ascii="Wingdings" w:hAnsi="Wingdings" w:hint="default"/>
+        <w:sz w:val="20"/>
+      </w:rPr>
+    </w:lvl>
+    <w:lvl w:ilvl="6" w:tentative="1">
+      <w:start w:val="1"/>
+      <w:numFmt w:val="bullet"/>
+      <w:lvlText w:val=""/>
+      <w:lvlJc w:val="left"/>
+      <w:pPr>
+        <w:tabs>
+          <w:tab w:val="num" w:pos="5040"/>
+        </w:tabs>
+        <w:ind w:left="5040" w:hanging="360"/>
+      </w:pPr>
+      <w:rPr>
+        <w:rFonts w:ascii="Wingdings" w:hAnsi="Wingdings" w:hint="default"/>
+        <w:sz w:val="20"/>
+      </w:rPr>
+    </w:lvl>
+    <w:lvl w:ilvl="7" w:tentative="1">
+      <w:start w:val="1"/>
+      <w:numFmt w:val="bullet"/>
+      <w:lvlText w:val=""/>
+      <w:lvlJc w:val="left"/>
+      <w:pPr>
+        <w:tabs>
+          <w:tab w:val="num" w:pos="5760"/>
+        </w:tabs>
+        <w:ind w:left="5760" w:hanging="360"/>
+      </w:pPr>
+      <w:rPr>
+        <w:rFonts w:ascii="Wingdings" w:hAnsi="Wingdings" w:hint="default"/>
+        <w:sz w:val="20"/>
+      </w:rPr>
+    </w:lvl>
+    <w:lvl w:ilvl="8" w:tentative="1">
+      <w:start w:val="1"/>
+      <w:numFmt w:val="bullet"/>
+      <w:lvlText w:val=""/>
+      <w:lvlJc w:val="left"/>
+      <w:pPr>
+        <w:tabs>
+          <w:tab w:val="num" w:pos="6480"/>
+        </w:tabs>
+        <w:ind w:left="6480" w:hanging="360"/>
+      </w:pPr>
+      <w:rPr>
+        <w:rFonts w:ascii="Wingdings" w:hAnsi="Wingdings" w:hint="default"/>
+        <w:sz w:val="20"/>
+      </w:rPr>
+    </w:lvl>
+  </w:abstractNum>
+  <w:abstractNum w:abstractNumId="14" w15:restartNumberingAfterBreak="0">
     <w:nsid w:val="3D0E133A"/>
     <w:multiLevelType w:val="multilevel"/>
     <w:tmpl w:val="8EB2B9A2"/>
@@ -8027,7 +8957,7 @@
       </w:pPr>
     </w:lvl>
   </w:abstractNum>
-  <w:abstractNum w:abstractNumId="14" w15:restartNumberingAfterBreak="0">
+  <w:abstractNum w:abstractNumId="15" w15:restartNumberingAfterBreak="0">
     <w:nsid w:val="3DB50C05"/>
     <w:multiLevelType w:val="multilevel"/>
     <w:tmpl w:val="870AFDDA"/>
@@ -8140,7 +9070,7 @@
       </w:pPr>
     </w:lvl>
   </w:abstractNum>
-  <w:abstractNum w:abstractNumId="15" w15:restartNumberingAfterBreak="0">
+  <w:abstractNum w:abstractNumId="16" w15:restartNumberingAfterBreak="0">
     <w:nsid w:val="3E4357BB"/>
     <w:multiLevelType w:val="hybridMultilevel"/>
     <w:tmpl w:val="C64CDB08"/>
@@ -8253,7 +9183,269 @@
       </w:rPr>
     </w:lvl>
   </w:abstractNum>
-  <w:abstractNum w:abstractNumId="16" w15:restartNumberingAfterBreak="0">
+  <w:abstractNum w:abstractNumId="17" w15:restartNumberingAfterBreak="0">
+    <w:nsid w:val="46172E1E"/>
+    <w:multiLevelType w:val="multilevel"/>
+    <w:tmpl w:val="DE80541E"/>
+    <w:lvl w:ilvl="0">
+      <w:start w:val="1"/>
+      <w:numFmt w:val="decimal"/>
+      <w:lvlText w:val="%1."/>
+      <w:lvlJc w:val="left"/>
+      <w:pPr>
+        <w:tabs>
+          <w:tab w:val="num" w:pos="720"/>
+        </w:tabs>
+        <w:ind w:left="720" w:hanging="360"/>
+      </w:pPr>
+    </w:lvl>
+    <w:lvl w:ilvl="1" w:tentative="1">
+      <w:start w:val="1"/>
+      <w:numFmt w:val="decimal"/>
+      <w:lvlText w:val="%2."/>
+      <w:lvlJc w:val="left"/>
+      <w:pPr>
+        <w:tabs>
+          <w:tab w:val="num" w:pos="1440"/>
+        </w:tabs>
+        <w:ind w:left="1440" w:hanging="360"/>
+      </w:pPr>
+    </w:lvl>
+    <w:lvl w:ilvl="2" w:tentative="1">
+      <w:start w:val="1"/>
+      <w:numFmt w:val="decimal"/>
+      <w:lvlText w:val="%3."/>
+      <w:lvlJc w:val="left"/>
+      <w:pPr>
+        <w:tabs>
+          <w:tab w:val="num" w:pos="2160"/>
+        </w:tabs>
+        <w:ind w:left="2160" w:hanging="360"/>
+      </w:pPr>
+    </w:lvl>
+    <w:lvl w:ilvl="3" w:tentative="1">
+      <w:start w:val="1"/>
+      <w:numFmt w:val="decimal"/>
+      <w:lvlText w:val="%4."/>
+      <w:lvlJc w:val="left"/>
+      <w:pPr>
+        <w:tabs>
+          <w:tab w:val="num" w:pos="2880"/>
+        </w:tabs>
+        <w:ind w:left="2880" w:hanging="360"/>
+      </w:pPr>
+    </w:lvl>
+    <w:lvl w:ilvl="4" w:tentative="1">
+      <w:start w:val="1"/>
+      <w:numFmt w:val="decimal"/>
+      <w:lvlText w:val="%5."/>
+      <w:lvlJc w:val="left"/>
+      <w:pPr>
+        <w:tabs>
+          <w:tab w:val="num" w:pos="3600"/>
+        </w:tabs>
+        <w:ind w:left="3600" w:hanging="360"/>
+      </w:pPr>
+    </w:lvl>
+    <w:lvl w:ilvl="5" w:tentative="1">
+      <w:start w:val="1"/>
+      <w:numFmt w:val="decimal"/>
+      <w:lvlText w:val="%6."/>
+      <w:lvlJc w:val="left"/>
+      <w:pPr>
+        <w:tabs>
+          <w:tab w:val="num" w:pos="4320"/>
+        </w:tabs>
+        <w:ind w:left="4320" w:hanging="360"/>
+      </w:pPr>
+    </w:lvl>
+    <w:lvl w:ilvl="6" w:tentative="1">
+      <w:start w:val="1"/>
+      <w:numFmt w:val="decimal"/>
+      <w:lvlText w:val="%7."/>
+      <w:lvlJc w:val="left"/>
+      <w:pPr>
+        <w:tabs>
+          <w:tab w:val="num" w:pos="5040"/>
+        </w:tabs>
+        <w:ind w:left="5040" w:hanging="360"/>
+      </w:pPr>
+    </w:lvl>
+    <w:lvl w:ilvl="7" w:tentative="1">
+      <w:start w:val="1"/>
+      <w:numFmt w:val="decimal"/>
+      <w:lvlText w:val="%8."/>
+      <w:lvlJc w:val="left"/>
+      <w:pPr>
+        <w:tabs>
+          <w:tab w:val="num" w:pos="5760"/>
+        </w:tabs>
+        <w:ind w:left="5760" w:hanging="360"/>
+      </w:pPr>
+    </w:lvl>
+    <w:lvl w:ilvl="8" w:tentative="1">
+      <w:start w:val="1"/>
+      <w:numFmt w:val="decimal"/>
+      <w:lvlText w:val="%9."/>
+      <w:lvlJc w:val="left"/>
+      <w:pPr>
+        <w:tabs>
+          <w:tab w:val="num" w:pos="6480"/>
+        </w:tabs>
+        <w:ind w:left="6480" w:hanging="360"/>
+      </w:pPr>
+    </w:lvl>
+  </w:abstractNum>
+  <w:abstractNum w:abstractNumId="18" w15:restartNumberingAfterBreak="0">
+    <w:nsid w:val="493B13DA"/>
+    <w:multiLevelType w:val="multilevel"/>
+    <w:tmpl w:val="72A6BB32"/>
+    <w:lvl w:ilvl="0">
+      <w:start w:val="1"/>
+      <w:numFmt w:val="bullet"/>
+      <w:lvlText w:val=""/>
+      <w:lvlJc w:val="left"/>
+      <w:pPr>
+        <w:tabs>
+          <w:tab w:val="num" w:pos="720"/>
+        </w:tabs>
+        <w:ind w:left="720" w:hanging="360"/>
+      </w:pPr>
+      <w:rPr>
+        <w:rFonts w:ascii="Symbol" w:hAnsi="Symbol" w:hint="default"/>
+        <w:sz w:val="20"/>
+      </w:rPr>
+    </w:lvl>
+    <w:lvl w:ilvl="1" w:tentative="1">
+      <w:start w:val="1"/>
+      <w:numFmt w:val="bullet"/>
+      <w:lvlText w:val="o"/>
+      <w:lvlJc w:val="left"/>
+      <w:pPr>
+        <w:tabs>
+          <w:tab w:val="num" w:pos="1440"/>
+        </w:tabs>
+        <w:ind w:left="1440" w:hanging="360"/>
+      </w:pPr>
+      <w:rPr>
+        <w:rFonts w:ascii="Courier New" w:hAnsi="Courier New" w:hint="default"/>
+        <w:sz w:val="20"/>
+      </w:rPr>
+    </w:lvl>
+    <w:lvl w:ilvl="2" w:tentative="1">
+      <w:start w:val="1"/>
+      <w:numFmt w:val="bullet"/>
+      <w:lvlText w:val=""/>
+      <w:lvlJc w:val="left"/>
+      <w:pPr>
+        <w:tabs>
+          <w:tab w:val="num" w:pos="2160"/>
+        </w:tabs>
+        <w:ind w:left="2160" w:hanging="360"/>
+      </w:pPr>
+      <w:rPr>
+        <w:rFonts w:ascii="Wingdings" w:hAnsi="Wingdings" w:hint="default"/>
+        <w:sz w:val="20"/>
+      </w:rPr>
+    </w:lvl>
+    <w:lvl w:ilvl="3" w:tentative="1">
+      <w:start w:val="1"/>
+      <w:numFmt w:val="bullet"/>
+      <w:lvlText w:val=""/>
+      <w:lvlJc w:val="left"/>
+      <w:pPr>
+        <w:tabs>
+          <w:tab w:val="num" w:pos="2880"/>
+        </w:tabs>
+        <w:ind w:left="2880" w:hanging="360"/>
+      </w:pPr>
+      <w:rPr>
+        <w:rFonts w:ascii="Wingdings" w:hAnsi="Wingdings" w:hint="default"/>
+        <w:sz w:val="20"/>
+      </w:rPr>
+    </w:lvl>
+    <w:lvl w:ilvl="4" w:tentative="1">
+      <w:start w:val="1"/>
+      <w:numFmt w:val="bullet"/>
+      <w:lvlText w:val=""/>
+      <w:lvlJc w:val="left"/>
+      <w:pPr>
+        <w:tabs>
+          <w:tab w:val="num" w:pos="3600"/>
+        </w:tabs>
+        <w:ind w:left="3600" w:hanging="360"/>
+      </w:pPr>
+      <w:rPr>
+        <w:rFonts w:ascii="Wingdings" w:hAnsi="Wingdings" w:hint="default"/>
+        <w:sz w:val="20"/>
+      </w:rPr>
+    </w:lvl>
+    <w:lvl w:ilvl="5" w:tentative="1">
+      <w:start w:val="1"/>
+      <w:numFmt w:val="bullet"/>
+      <w:lvlText w:val=""/>
+      <w:lvlJc w:val="left"/>
+      <w:pPr>
+        <w:tabs>
+          <w:tab w:val="num" w:pos="4320"/>
+        </w:tabs>
+        <w:ind w:left="4320" w:hanging="360"/>
+      </w:pPr>
+      <w:rPr>
+        <w:rFonts w:ascii="Wingdings" w:hAnsi="Wingdings" w:hint="default"/>
+        <w:sz w:val="20"/>
+      </w:rPr>
+    </w:lvl>
+    <w:lvl w:ilvl="6" w:tentative="1">
+      <w:start w:val="1"/>
+      <w:numFmt w:val="bullet"/>
+      <w:lvlText w:val=""/>
+      <w:lvlJc w:val="left"/>
+      <w:pPr>
+        <w:tabs>
+          <w:tab w:val="num" w:pos="5040"/>
+        </w:tabs>
+        <w:ind w:left="5040" w:hanging="360"/>
+      </w:pPr>
+      <w:rPr>
+        <w:rFonts w:ascii="Wingdings" w:hAnsi="Wingdings" w:hint="default"/>
+        <w:sz w:val="20"/>
+      </w:rPr>
+    </w:lvl>
+    <w:lvl w:ilvl="7" w:tentative="1">
+      <w:start w:val="1"/>
+      <w:numFmt w:val="bullet"/>
+      <w:lvlText w:val=""/>
+      <w:lvlJc w:val="left"/>
+      <w:pPr>
+        <w:tabs>
+          <w:tab w:val="num" w:pos="5760"/>
+        </w:tabs>
+        <w:ind w:left="5760" w:hanging="360"/>
+      </w:pPr>
+      <w:rPr>
+        <w:rFonts w:ascii="Wingdings" w:hAnsi="Wingdings" w:hint="default"/>
+        <w:sz w:val="20"/>
+      </w:rPr>
+    </w:lvl>
+    <w:lvl w:ilvl="8" w:tentative="1">
+      <w:start w:val="1"/>
+      <w:numFmt w:val="bullet"/>
+      <w:lvlText w:val=""/>
+      <w:lvlJc w:val="left"/>
+      <w:pPr>
+        <w:tabs>
+          <w:tab w:val="num" w:pos="6480"/>
+        </w:tabs>
+        <w:ind w:left="6480" w:hanging="360"/>
+      </w:pPr>
+      <w:rPr>
+        <w:rFonts w:ascii="Wingdings" w:hAnsi="Wingdings" w:hint="default"/>
+        <w:sz w:val="20"/>
+      </w:rPr>
+    </w:lvl>
+  </w:abstractNum>
+  <w:abstractNum w:abstractNumId="19" w15:restartNumberingAfterBreak="0">
     <w:nsid w:val="4ACA676C"/>
     <w:multiLevelType w:val="multilevel"/>
     <w:tmpl w:val="C21EA758"/>
@@ -8402,7 +9594,120 @@
       </w:rPr>
     </w:lvl>
   </w:abstractNum>
-  <w:abstractNum w:abstractNumId="17" w15:restartNumberingAfterBreak="0">
+  <w:abstractNum w:abstractNumId="20" w15:restartNumberingAfterBreak="0">
+    <w:nsid w:val="4CFF2113"/>
+    <w:multiLevelType w:val="multilevel"/>
+    <w:tmpl w:val="32926408"/>
+    <w:lvl w:ilvl="0">
+      <w:start w:val="1"/>
+      <w:numFmt w:val="decimal"/>
+      <w:lvlText w:val="%1."/>
+      <w:lvlJc w:val="left"/>
+      <w:pPr>
+        <w:tabs>
+          <w:tab w:val="num" w:pos="720"/>
+        </w:tabs>
+        <w:ind w:left="720" w:hanging="360"/>
+      </w:pPr>
+    </w:lvl>
+    <w:lvl w:ilvl="1" w:tentative="1">
+      <w:start w:val="1"/>
+      <w:numFmt w:val="decimal"/>
+      <w:lvlText w:val="%2."/>
+      <w:lvlJc w:val="left"/>
+      <w:pPr>
+        <w:tabs>
+          <w:tab w:val="num" w:pos="1440"/>
+        </w:tabs>
+        <w:ind w:left="1440" w:hanging="360"/>
+      </w:pPr>
+    </w:lvl>
+    <w:lvl w:ilvl="2" w:tentative="1">
+      <w:start w:val="1"/>
+      <w:numFmt w:val="decimal"/>
+      <w:lvlText w:val="%3."/>
+      <w:lvlJc w:val="left"/>
+      <w:pPr>
+        <w:tabs>
+          <w:tab w:val="num" w:pos="2160"/>
+        </w:tabs>
+        <w:ind w:left="2160" w:hanging="360"/>
+      </w:pPr>
+    </w:lvl>
+    <w:lvl w:ilvl="3" w:tentative="1">
+      <w:start w:val="1"/>
+      <w:numFmt w:val="decimal"/>
+      <w:lvlText w:val="%4."/>
+      <w:lvlJc w:val="left"/>
+      <w:pPr>
+        <w:tabs>
+          <w:tab w:val="num" w:pos="2880"/>
+        </w:tabs>
+        <w:ind w:left="2880" w:hanging="360"/>
+      </w:pPr>
+    </w:lvl>
+    <w:lvl w:ilvl="4" w:tentative="1">
+      <w:start w:val="1"/>
+      <w:numFmt w:val="decimal"/>
+      <w:lvlText w:val="%5."/>
+      <w:lvlJc w:val="left"/>
+      <w:pPr>
+        <w:tabs>
+          <w:tab w:val="num" w:pos="3600"/>
+        </w:tabs>
+        <w:ind w:left="3600" w:hanging="360"/>
+      </w:pPr>
+    </w:lvl>
+    <w:lvl w:ilvl="5" w:tentative="1">
+      <w:start w:val="1"/>
+      <w:numFmt w:val="decimal"/>
+      <w:lvlText w:val="%6."/>
+      <w:lvlJc w:val="left"/>
+      <w:pPr>
+        <w:tabs>
+          <w:tab w:val="num" w:pos="4320"/>
+        </w:tabs>
+        <w:ind w:left="4320" w:hanging="360"/>
+      </w:pPr>
+    </w:lvl>
+    <w:lvl w:ilvl="6" w:tentative="1">
+      <w:start w:val="1"/>
+      <w:numFmt w:val="decimal"/>
+      <w:lvlText w:val="%7."/>
+      <w:lvlJc w:val="left"/>
+      <w:pPr>
+        <w:tabs>
+          <w:tab w:val="num" w:pos="5040"/>
+        </w:tabs>
+        <w:ind w:left="5040" w:hanging="360"/>
+      </w:pPr>
+    </w:lvl>
+    <w:lvl w:ilvl="7" w:tentative="1">
+      <w:start w:val="1"/>
+      <w:numFmt w:val="decimal"/>
+      <w:lvlText w:val="%8."/>
+      <w:lvlJc w:val="left"/>
+      <w:pPr>
+        <w:tabs>
+          <w:tab w:val="num" w:pos="5760"/>
+        </w:tabs>
+        <w:ind w:left="5760" w:hanging="360"/>
+      </w:pPr>
+    </w:lvl>
+    <w:lvl w:ilvl="8" w:tentative="1">
+      <w:start w:val="1"/>
+      <w:numFmt w:val="decimal"/>
+      <w:lvlText w:val="%9."/>
+      <w:lvlJc w:val="left"/>
+      <w:pPr>
+        <w:tabs>
+          <w:tab w:val="num" w:pos="6480"/>
+        </w:tabs>
+        <w:ind w:left="6480" w:hanging="360"/>
+      </w:pPr>
+    </w:lvl>
+  </w:abstractNum>
+  <w:abstractNum w:abstractNumId="21" w15:restartNumberingAfterBreak="0">
     <w:nsid w:val="50F5196E"/>
     <w:multiLevelType w:val="hybridMultilevel"/>
     <w:tmpl w:val="C4CA2B0E"/>
@@ -8492,7 +9797,120 @@
       </w:pPr>
     </w:lvl>
   </w:abstractNum>
-  <w:abstractNum w:abstractNumId="18" w15:restartNumberingAfterBreak="0">
+  <w:abstractNum w:abstractNumId="22" w15:restartNumberingAfterBreak="0">
+    <w:nsid w:val="56844AF1"/>
+    <w:multiLevelType w:val="multilevel"/>
+    <w:tmpl w:val="AE6256D8"/>
+    <w:lvl w:ilvl="0">
+      <w:start w:val="1"/>
+      <w:numFmt w:val="decimal"/>
+      <w:lvlText w:val="%1."/>
+      <w:lvlJc w:val="left"/>
+      <w:pPr>
+        <w:tabs>
+          <w:tab w:val="num" w:pos="720"/>
+        </w:tabs>
+        <w:ind w:left="720" w:hanging="360"/>
+      </w:pPr>
+    </w:lvl>
+    <w:lvl w:ilvl="1" w:tentative="1">
+      <w:start w:val="1"/>
+      <w:numFmt w:val="decimal"/>
+      <w:lvlText w:val="%2."/>
+      <w:lvlJc w:val="left"/>
+      <w:pPr>
+        <w:tabs>
+          <w:tab w:val="num" w:pos="1440"/>
+        </w:tabs>
+        <w:ind w:left="1440" w:hanging="360"/>
+      </w:pPr>
+    </w:lvl>
+    <w:lvl w:ilvl="2" w:tentative="1">
+      <w:start w:val="1"/>
+      <w:numFmt w:val="decimal"/>
+      <w:lvlText w:val="%3."/>
+      <w:lvlJc w:val="left"/>
+      <w:pPr>
+        <w:tabs>
+          <w:tab w:val="num" w:pos="2160"/>
+        </w:tabs>
+        <w:ind w:left="2160" w:hanging="360"/>
+      </w:pPr>
+    </w:lvl>
+    <w:lvl w:ilvl="3" w:tentative="1">
+      <w:start w:val="1"/>
+      <w:numFmt w:val="decimal"/>
+      <w:lvlText w:val="%4."/>
+      <w:lvlJc w:val="left"/>
+      <w:pPr>
+        <w:tabs>
+          <w:tab w:val="num" w:pos="2880"/>
+        </w:tabs>
+        <w:ind w:left="2880" w:hanging="360"/>
+      </w:pPr>
+    </w:lvl>
+    <w:lvl w:ilvl="4" w:tentative="1">
+      <w:start w:val="1"/>
+      <w:numFmt w:val="decimal"/>
+      <w:lvlText w:val="%5."/>
+      <w:lvlJc w:val="left"/>
+      <w:pPr>
+        <w:tabs>
+          <w:tab w:val="num" w:pos="3600"/>
+        </w:tabs>
+        <w:ind w:left="3600" w:hanging="360"/>
+      </w:pPr>
+    </w:lvl>
+    <w:lvl w:ilvl="5" w:tentative="1">
+      <w:start w:val="1"/>
+      <w:numFmt w:val="decimal"/>
+      <w:lvlText w:val="%6."/>
+      <w:lvlJc w:val="left"/>
+      <w:pPr>
+        <w:tabs>
+          <w:tab w:val="num" w:pos="4320"/>
+        </w:tabs>
+        <w:ind w:left="4320" w:hanging="360"/>
+      </w:pPr>
+    </w:lvl>
+    <w:lvl w:ilvl="6" w:tentative="1">
+      <w:start w:val="1"/>
+      <w:numFmt w:val="decimal"/>
+      <w:lvlText w:val="%7."/>
+      <w:lvlJc w:val="left"/>
+      <w:pPr>
+        <w:tabs>
+          <w:tab w:val="num" w:pos="5040"/>
+        </w:tabs>
+        <w:ind w:left="5040" w:hanging="360"/>
+      </w:pPr>
+    </w:lvl>
+    <w:lvl w:ilvl="7" w:tentative="1">
+      <w:start w:val="1"/>
+      <w:numFmt w:val="decimal"/>
+      <w:lvlText w:val="%8."/>
+      <w:lvlJc w:val="left"/>
+      <w:pPr>
+        <w:tabs>
+          <w:tab w:val="num" w:pos="5760"/>
+        </w:tabs>
+        <w:ind w:left="5760" w:hanging="360"/>
+      </w:pPr>
+    </w:lvl>
+    <w:lvl w:ilvl="8" w:tentative="1">
+      <w:start w:val="1"/>
+      <w:numFmt w:val="decimal"/>
+      <w:lvlText w:val="%9."/>
+      <w:lvlJc w:val="left"/>
+      <w:pPr>
+        <w:tabs>
+          <w:tab w:val="num" w:pos="6480"/>
+        </w:tabs>
+        <w:ind w:left="6480" w:hanging="360"/>
+      </w:pPr>
+    </w:lvl>
+  </w:abstractNum>
+  <w:abstractNum w:abstractNumId="23" w15:restartNumberingAfterBreak="0">
     <w:nsid w:val="59A67A6A"/>
     <w:multiLevelType w:val="multilevel"/>
     <w:tmpl w:val="F58A3BB4"/>
@@ -8609,7 +10027,7 @@
       </w:pPr>
     </w:lvl>
   </w:abstractNum>
-  <w:abstractNum w:abstractNumId="19" w15:restartNumberingAfterBreak="0">
+  <w:abstractNum w:abstractNumId="24" w15:restartNumberingAfterBreak="0">
     <w:nsid w:val="61DD2385"/>
     <w:multiLevelType w:val="multilevel"/>
     <w:tmpl w:val="9F74D4C0"/>
@@ -8722,7 +10140,7 @@
       </w:pPr>
     </w:lvl>
   </w:abstractNum>
-  <w:abstractNum w:abstractNumId="20" w15:restartNumberingAfterBreak="0">
+  <w:abstractNum w:abstractNumId="25" w15:restartNumberingAfterBreak="0">
     <w:nsid w:val="6EEA44CF"/>
     <w:multiLevelType w:val="multilevel"/>
     <w:tmpl w:val="1D186DC2"/>
@@ -8871,7 +10289,7 @@
       </w:rPr>
     </w:lvl>
   </w:abstractNum>
-  <w:abstractNum w:abstractNumId="21" w15:restartNumberingAfterBreak="0">
+  <w:abstractNum w:abstractNumId="26" w15:restartNumberingAfterBreak="0">
     <w:nsid w:val="70222B09"/>
     <w:multiLevelType w:val="multilevel"/>
     <w:tmpl w:val="63482326"/>
@@ -8984,7 +10402,7 @@
       </w:pPr>
     </w:lvl>
   </w:abstractNum>
-  <w:abstractNum w:abstractNumId="22" w15:restartNumberingAfterBreak="0">
+  <w:abstractNum w:abstractNumId="27" w15:restartNumberingAfterBreak="0">
     <w:nsid w:val="7481558F"/>
     <w:multiLevelType w:val="multilevel"/>
     <w:tmpl w:val="51B4E424"/>
@@ -9133,7 +10551,156 @@
       </w:rPr>
     </w:lvl>
   </w:abstractNum>
-  <w:abstractNum w:abstractNumId="23" w15:restartNumberingAfterBreak="0">
+  <w:abstractNum w:abstractNumId="28" w15:restartNumberingAfterBreak="0">
+    <w:nsid w:val="762B262C"/>
+    <w:multiLevelType w:val="multilevel"/>
+    <w:tmpl w:val="43209EDE"/>
+    <w:lvl w:ilvl="0">
+      <w:start w:val="1"/>
+      <w:numFmt w:val="bullet"/>
+      <w:lvlText w:val=""/>
+      <w:lvlJc w:val="left"/>
+      <w:pPr>
+        <w:tabs>
+          <w:tab w:val="num" w:pos="720"/>
+        </w:tabs>
+        <w:ind w:left="720" w:hanging="360"/>
+      </w:pPr>
+      <w:rPr>
+        <w:rFonts w:ascii="Symbol" w:hAnsi="Symbol" w:hint="default"/>
+        <w:sz w:val="20"/>
+      </w:rPr>
+    </w:lvl>
+    <w:lvl w:ilvl="1" w:tentative="1">
+      <w:start w:val="1"/>
+      <w:numFmt w:val="bullet"/>
+      <w:lvlText w:val="o"/>
+      <w:lvlJc w:val="left"/>
+      <w:pPr>
+        <w:tabs>
+          <w:tab w:val="num" w:pos="1440"/>
+        </w:tabs>
+        <w:ind w:left="1440" w:hanging="360"/>
+      </w:pPr>
+      <w:rPr>
+        <w:rFonts w:ascii="Courier New" w:hAnsi="Courier New" w:hint="default"/>
+        <w:sz w:val="20"/>
+      </w:rPr>
+    </w:lvl>
+    <w:lvl w:ilvl="2" w:tentative="1">
+      <w:start w:val="1"/>
+      <w:numFmt w:val="bullet"/>
+      <w:lvlText w:val=""/>
+      <w:lvlJc w:val="left"/>
+      <w:pPr>
+        <w:tabs>
+          <w:tab w:val="num" w:pos="2160"/>
+        </w:tabs>
+        <w:ind w:left="2160" w:hanging="360"/>
+      </w:pPr>
+      <w:rPr>
+        <w:rFonts w:ascii="Wingdings" w:hAnsi="Wingdings" w:hint="default"/>
+        <w:sz w:val="20"/>
+      </w:rPr>
+    </w:lvl>
+    <w:lvl w:ilvl="3" w:tentative="1">
+      <w:start w:val="1"/>
+      <w:numFmt w:val="bullet"/>
+      <w:lvlText w:val=""/>
+      <w:lvlJc w:val="left"/>
+      <w:pPr>
+        <w:tabs>
+          <w:tab w:val="num" w:pos="2880"/>
+        </w:tabs>
+        <w:ind w:left="2880" w:hanging="360"/>
+      </w:pPr>
+      <w:rPr>
+        <w:rFonts w:ascii="Wingdings" w:hAnsi="Wingdings" w:hint="default"/>
+        <w:sz w:val="20"/>
+      </w:rPr>
+    </w:lvl>
+    <w:lvl w:ilvl="4" w:tentative="1">
+      <w:start w:val="1"/>
+      <w:numFmt w:val="bullet"/>
+      <w:lvlText w:val=""/>
+      <w:lvlJc w:val="left"/>
+      <w:pPr>
+        <w:tabs>
+          <w:tab w:val="num" w:pos="3600"/>
+        </w:tabs>
+        <w:ind w:left="3600" w:hanging="360"/>
+      </w:pPr>
+      <w:rPr>
+        <w:rFonts w:ascii="Wingdings" w:hAnsi="Wingdings" w:hint="default"/>
+        <w:sz w:val="20"/>
+      </w:rPr>
+    </w:lvl>
+    <w:lvl w:ilvl="5" w:tentative="1">
+      <w:start w:val="1"/>
+      <w:numFmt w:val="bullet"/>
+      <w:lvlText w:val=""/>
+      <w:lvlJc w:val="left"/>
+      <w:pPr>
+        <w:tabs>
+          <w:tab w:val="num" w:pos="4320"/>
+        </w:tabs>
+        <w:ind w:left="4320" w:hanging="360"/>
+      </w:pPr>
+      <w:rPr>
+        <w:rFonts w:ascii="Wingdings" w:hAnsi="Wingdings" w:hint="default"/>
+        <w:sz w:val="20"/>
+      </w:rPr>
+    </w:lvl>
+    <w:lvl w:ilvl="6" w:tentative="1">
+      <w:start w:val="1"/>
+      <w:numFmt w:val="bullet"/>
+      <w:lvlText w:val=""/>
+      <w:lvlJc w:val="left"/>
+      <w:pPr>
+        <w:tabs>
+          <w:tab w:val="num" w:pos="5040"/>
+        </w:tabs>
+        <w:ind w:left="5040" w:hanging="360"/>
+      </w:pPr>
+      <w:rPr>
+        <w:rFonts w:ascii="Wingdings" w:hAnsi="Wingdings" w:hint="default"/>
+        <w:sz w:val="20"/>
+      </w:rPr>
+    </w:lvl>
+    <w:lvl w:ilvl="7" w:tentative="1">
+      <w:start w:val="1"/>
+      <w:numFmt w:val="bullet"/>
+      <w:lvlText w:val=""/>
+      <w:lvlJc w:val="left"/>
+      <w:pPr>
+        <w:tabs>
+          <w:tab w:val="num" w:pos="5760"/>
+        </w:tabs>
+        <w:ind w:left="5760" w:hanging="360"/>
+      </w:pPr>
+      <w:rPr>
+        <w:rFonts w:ascii="Wingdings" w:hAnsi="Wingdings" w:hint="default"/>
+        <w:sz w:val="20"/>
+      </w:rPr>
+    </w:lvl>
+    <w:lvl w:ilvl="8" w:tentative="1">
+      <w:start w:val="1"/>
+      <w:numFmt w:val="bullet"/>
+      <w:lvlText w:val=""/>
+      <w:lvlJc w:val="left"/>
+      <w:pPr>
+        <w:tabs>
+          <w:tab w:val="num" w:pos="6480"/>
+        </w:tabs>
+        <w:ind w:left="6480" w:hanging="360"/>
+      </w:pPr>
+      <w:rPr>
+        <w:rFonts w:ascii="Wingdings" w:hAnsi="Wingdings" w:hint="default"/>
+        <w:sz w:val="20"/>
+      </w:rPr>
+    </w:lvl>
+  </w:abstractNum>
+  <w:abstractNum w:abstractNumId="29" w15:restartNumberingAfterBreak="0">
     <w:nsid w:val="7CF7747C"/>
     <w:multiLevelType w:val="multilevel"/>
     <w:tmpl w:val="0C78B62E"/>
@@ -9282,7 +10849,7 @@
       </w:rPr>
     </w:lvl>
   </w:abstractNum>
-  <w:abstractNum w:abstractNumId="24" w15:restartNumberingAfterBreak="0">
+  <w:abstractNum w:abstractNumId="30" w15:restartNumberingAfterBreak="0">
     <w:nsid w:val="7D24113A"/>
     <w:multiLevelType w:val="hybridMultilevel"/>
     <w:tmpl w:val="83140B1E"/>
@@ -9371,7 +10938,7 @@
       </w:pPr>
     </w:lvl>
   </w:abstractNum>
-  <w:abstractNum w:abstractNumId="25" w15:restartNumberingAfterBreak="0">
+  <w:abstractNum w:abstractNumId="31" w15:restartNumberingAfterBreak="0">
     <w:nsid w:val="7F897BEC"/>
     <w:multiLevelType w:val="hybridMultilevel"/>
     <w:tmpl w:val="53E83E7A"/>
@@ -9461,34 +11028,34 @@
     </w:lvl>
   </w:abstractNum>
   <w:num w:numId="1" w16cid:durableId="358745787">
-    <w:abstractNumId w:val="13"/>
+    <w:abstractNumId w:val="14"/>
   </w:num>
   <w:num w:numId="2" w16cid:durableId="668677464">
-    <w:abstractNumId w:val="14"/>
+    <w:abstractNumId w:val="15"/>
   </w:num>
   <w:num w:numId="3" w16cid:durableId="1054963083">
     <w:abstractNumId w:val="4"/>
   </w:num>
   <w:num w:numId="4" w16cid:durableId="1671061294">
-    <w:abstractNumId w:val="24"/>
+    <w:abstractNumId w:val="30"/>
   </w:num>
   <w:num w:numId="5" w16cid:durableId="224684202">
     <w:abstractNumId w:val="3"/>
   </w:num>
   <w:num w:numId="6" w16cid:durableId="1886673902">
-    <w:abstractNumId w:val="15"/>
+    <w:abstractNumId w:val="16"/>
   </w:num>
   <w:num w:numId="7" w16cid:durableId="2102674627">
+    <w:abstractNumId w:val="31"/>
+  </w:num>
+  <w:num w:numId="8" w16cid:durableId="1704359959">
+    <w:abstractNumId w:val="23"/>
+  </w:num>
+  <w:num w:numId="9" w16cid:durableId="140736742">
     <w:abstractNumId w:val="25"/>
   </w:num>
-  <w:num w:numId="8" w16cid:durableId="1704359959">
-    <w:abstractNumId w:val="18"/>
-  </w:num>
-  <w:num w:numId="9" w16cid:durableId="140736742">
-    <w:abstractNumId w:val="20"/>
-  </w:num>
   <w:num w:numId="10" w16cid:durableId="732898086">
-    <w:abstractNumId w:val="19"/>
+    <w:abstractNumId w:val="24"/>
   </w:num>
   <w:num w:numId="11" w16cid:durableId="2039701554">
     <w:abstractNumId w:val="7"/>
@@ -9509,13 +11076,13 @@
     <w:abstractNumId w:val="2"/>
   </w:num>
   <w:num w:numId="17" w16cid:durableId="723721517">
-    <w:abstractNumId w:val="16"/>
+    <w:abstractNumId w:val="19"/>
   </w:num>
   <w:num w:numId="18" w16cid:durableId="1944221706">
-    <w:abstractNumId w:val="21"/>
+    <w:abstractNumId w:val="26"/>
   </w:num>
   <w:num w:numId="19" w16cid:durableId="2050060419">
-    <w:abstractNumId w:val="22"/>
+    <w:abstractNumId w:val="27"/>
   </w:num>
   <w:num w:numId="20" w16cid:durableId="633216489">
     <w:abstractNumId w:val="9"/>
@@ -9524,7 +11091,7 @@
     <w:abstractNumId w:val="10"/>
   </w:num>
   <w:num w:numId="22" w16cid:durableId="1791317214">
-    <w:abstractNumId w:val="17"/>
+    <w:abstractNumId w:val="21"/>
   </w:num>
   <w:num w:numId="23" w16cid:durableId="453523644">
     <w:abstractNumId w:val="6"/>
@@ -9533,10 +11100,28 @@
     <w:abstractNumId w:val="11"/>
   </w:num>
   <w:num w:numId="25" w16cid:durableId="1314724520">
-    <w:abstractNumId w:val="23"/>
+    <w:abstractNumId w:val="29"/>
   </w:num>
   <w:num w:numId="26" w16cid:durableId="1238249335">
     <w:abstractNumId w:val="5"/>
+  </w:num>
+  <w:num w:numId="27" w16cid:durableId="1868324898">
+    <w:abstractNumId w:val="13"/>
+  </w:num>
+  <w:num w:numId="28" w16cid:durableId="1320231442">
+    <w:abstractNumId w:val="17"/>
+  </w:num>
+  <w:num w:numId="29" w16cid:durableId="195625241">
+    <w:abstractNumId w:val="18"/>
+  </w:num>
+  <w:num w:numId="30" w16cid:durableId="2084328412">
+    <w:abstractNumId w:val="22"/>
+  </w:num>
+  <w:num w:numId="31" w16cid:durableId="170334401">
+    <w:abstractNumId w:val="28"/>
+  </w:num>
+  <w:num w:numId="32" w16cid:durableId="195041899">
+    <w:abstractNumId w:val="20"/>
   </w:num>
 </w:numbering>
 </file>
@@ -10632,28 +12217,28 @@
 </file>
 
 <file path=customXml/item1.xml><?xml version="1.0" encoding="utf-8"?>
-<b:Sources xmlns:b="http://schemas.openxmlformats.org/officeDocument/2006/bibliography" xmlns="http://schemas.openxmlformats.org/officeDocument/2006/bibliography" SelectedStyle="\APASixthEditionOfficeOnline.xsl" StyleName="APA" Version="6"/>
-</file>
-
-<file path=customXml/item2.xml><?xml version="1.0" encoding="utf-8"?>
 <go:gDocsCustomXmlDataStorage xmlns:go="http://customooxmlschemas.google.com/" xmlns:r="http://schemas.openxmlformats.org/officeDocument/2006/relationships" uri="GoogleDocsCustomDataVersion2">
   <go:docsCustomData xmlns:go="http://customooxmlschemas.google.com/" roundtripDataSignature="AMtx7mgjIi8mV/ll7RC7RGGXrONUlBLqNw==">CgMxLjAyDmgubjZ6NWc0dTI2b2kzMg5oLm9mYTFhemt2NXJhbTIOaC45YXdpd2prZWp5YmMyDmguaWwwMTZiMnQzYXMzMg5oLjY3eXl2dTdkdmFuYTgAciExbk1zQVJYN1ZyVTR2b0Joc1hRSmY1enRLM2JXWVhrZDU=</go:docsCustomData>
 </go:gDocsCustomXmlDataStorage>
 </file>
 
-<file path=customXml/itemProps1.xml><?xml version="1.0" encoding="utf-8"?>
-<ds:datastoreItem xmlns:ds="http://schemas.openxmlformats.org/officeDocument/2006/customXml" ds:itemID="{2EC9EC03-D02E-4056-A37D-CA6E9DCD92DB}">
-  <ds:schemaRefs>
-    <ds:schemaRef ds:uri="http://schemas.openxmlformats.org/officeDocument/2006/bibliography"/>
-  </ds:schemaRefs>
-</ds:datastoreItem>
+<file path=customXml/item2.xml><?xml version="1.0" encoding="utf-8"?>
+<b:Sources xmlns:b="http://schemas.openxmlformats.org/officeDocument/2006/bibliography" xmlns="http://schemas.openxmlformats.org/officeDocument/2006/bibliography" SelectedStyle="\APASixthEditionOfficeOnline.xsl" StyleName="APA" Version="6"/>
 </file>
 
-<file path=customXml/itemProps2.xml><?xml version="1.0" encoding="utf-8"?>
+<file path=customXml/itemProps1.xml><?xml version="1.0" encoding="utf-8"?>
 <ds:datastoreItem xmlns:ds="http://schemas.openxmlformats.org/officeDocument/2006/customXml" ds:itemID="{11111111-1234-1234-1234-123412341234}">
   <ds:schemaRefs>
     <ds:schemaRef ds:uri="http://customooxmlschemas.google.com/"/>
     <ds:schemaRef ds:uri="http://schemas.openxmlformats.org/officeDocument/2006/relationships"/>
   </ds:schemaRefs>
 </ds:datastoreItem>
+</file>
+
+<file path=customXml/itemProps2.xml><?xml version="1.0" encoding="utf-8"?>
+<ds:datastoreItem xmlns:ds="http://schemas.openxmlformats.org/officeDocument/2006/customXml" ds:itemID="{2EC9EC03-D02E-4056-A37D-CA6E9DCD92DB}">
+  <ds:schemaRefs>
+    <ds:schemaRef ds:uri="http://schemas.openxmlformats.org/officeDocument/2006/bibliography"/>
+  </ds:schemaRefs>
+</ds:datastoreItem>
 </file>
</xml_diff>